<commit_message>
docs: update sources list — alphabetical order, blue hyperlinks, no access dates
https://claude.ai/code/session_01WBcR9y3fb3gMXiFrPhvoBr
</commit_message>
<xml_diff>
--- a/docs/reports/Список_источников_РЕМНАНТ.docx
+++ b/docs/reports/Список_источников_РЕМНАНТ.docx
@@ -30,7 +30,29 @@
           <w:color w:val="000000"/>
           <w:sz w:val="28"/>
         </w:rPr>
-        <w:t>1. Бейтс М. CoffeeScript. Второе дыхание JavaScript: практическое руководство. — М.: ДМК Пресс, 2023. — 311 с. — ISBN 978-5-89818-581-7. — URL: https://znanium.ru/catalog/document?id=435452 (дата обращения: 25.04.2026).</w:t>
+        <w:t xml:space="preserve">1. Бейтс М. CoffeeScript. Второе дыхание JavaScript: практическое руководство. — М.: ДМК Пресс, 2023. — 311 с. — ISBN 978-5-89818-581-7. — URL: </w:t>
+      </w:r>
+      <w:hyperlink r:id="rId9">
+        <w:r>
+          <w:rPr>
+            <w:rStyle w:val="Hyperlink"/>
+            <w:rFonts w:ascii="Times New Roman" w:hAnsi="Times New Roman" w:cs="Times New Roman" w:eastAsia="Times New Roman"/>
+            <w:sz w:val="28"/>
+            <w:szCs w:val="28"/>
+            <w:color w:val="0563C1"/>
+            <w:u w:val="single"/>
+          </w:rPr>
+          <w:t xml:space="preserve">https://znanium.ru/catalog/document?id=435452</w:t>
+        </w:r>
+      </w:hyperlink>
+      <w:r>
+        <w:rPr>
+          <w:rFonts w:ascii="Times New Roman" w:hAnsi="Times New Roman" w:cs="Times New Roman" w:eastAsia="Times New Roman"/>
+          <w:b w:val="0"/>
+          <w:color w:val="000000"/>
+          <w:sz w:val="28"/>
+        </w:rPr>
+        <w:t>.</w:t>
       </w:r>
     </w:p>
     <w:p>
@@ -46,7 +68,29 @@
           <w:color w:val="000000"/>
           <w:sz w:val="28"/>
         </w:rPr>
-        <w:t>2. Гладкий А. А. Веб-самоделкин. Как самому создать сайт быстро и профессионально: практическое руководство. — М.: Директ-Медиа, 2020. — 265 с. — ISBN 978-5-4499-1220-6. — URL: https://znanium.ru/catalog/document?id=400321 (дата обращения: 25.04.2026).</w:t>
+        <w:t xml:space="preserve">2. Гладкий А. А. Веб-самоделкин. Как самому создать сайт быстро и профессионально: практическое руководство. — М.: Директ-Медиа, 2020. — 265 с. — ISBN 978-5-4499-1220-6. — URL: </w:t>
+      </w:r>
+      <w:hyperlink r:id="rId10">
+        <w:r>
+          <w:rPr>
+            <w:rStyle w:val="Hyperlink"/>
+            <w:rFonts w:ascii="Times New Roman" w:hAnsi="Times New Roman" w:cs="Times New Roman" w:eastAsia="Times New Roman"/>
+            <w:sz w:val="28"/>
+            <w:szCs w:val="28"/>
+            <w:color w:val="0563C1"/>
+            <w:u w:val="single"/>
+          </w:rPr>
+          <w:t xml:space="preserve">https://znanium.ru/catalog/document?id=400321</w:t>
+        </w:r>
+      </w:hyperlink>
+      <w:r>
+        <w:rPr>
+          <w:rFonts w:ascii="Times New Roman" w:hAnsi="Times New Roman" w:cs="Times New Roman" w:eastAsia="Times New Roman"/>
+          <w:b w:val="0"/>
+          <w:color w:val="000000"/>
+          <w:sz w:val="28"/>
+        </w:rPr>
+        <w:t>.</w:t>
       </w:r>
     </w:p>
     <w:p>
@@ -142,7 +186,29 @@
           <w:color w:val="000000"/>
           <w:sz w:val="28"/>
         </w:rPr>
-        <w:t>8. Дронов В. А. HTML 5, CSS 3 и Web 2.0. Разработка современных веб-сайтов. — СПб.: БХВ-Петербург, 2020. — 408 с. — URL: https://www.litres.ru/ (дата обращения: 30.04.2026).</w:t>
+        <w:t xml:space="preserve">8. Дронов В. А. HTML 5, CSS 3 и Web 2.0. Разработка современных веб-сайтов. — СПб.: БХВ-Петербург, 2020. — 408 с. — URL: </w:t>
+      </w:r>
+      <w:hyperlink r:id="rId11">
+        <w:r>
+          <w:rPr>
+            <w:rStyle w:val="Hyperlink"/>
+            <w:rFonts w:ascii="Times New Roman" w:hAnsi="Times New Roman" w:cs="Times New Roman" w:eastAsia="Times New Roman"/>
+            <w:sz w:val="28"/>
+            <w:szCs w:val="28"/>
+            <w:color w:val="0563C1"/>
+            <w:u w:val="single"/>
+          </w:rPr>
+          <w:t xml:space="preserve">https://www.litres.ru/book/vladimir-dronov/html-5-css-3-i-web-20-razrabotka-sovremennyh-veb-saytov-8559189/</w:t>
+        </w:r>
+      </w:hyperlink>
+      <w:r>
+        <w:rPr>
+          <w:rFonts w:ascii="Times New Roman" w:hAnsi="Times New Roman" w:cs="Times New Roman" w:eastAsia="Times New Roman"/>
+          <w:b w:val="0"/>
+          <w:color w:val="000000"/>
+          <w:sz w:val="28"/>
+        </w:rPr>
+        <w:t>.</w:t>
       </w:r>
     </w:p>
     <w:p>
@@ -174,7 +240,29 @@
           <w:color w:val="000000"/>
           <w:sz w:val="28"/>
         </w:rPr>
-        <w:t>10. Зыков С. В. Программирование: учебник и практикум для вузов. — 2-е изд., перераб. и доп. — М.: Юрайт, 2025. — 285 с. — ISBN 978-5-534-16031-4. — URL: https://urait.ru/bcode/560815 (дата обращения: 28.04.2026).</w:t>
+        <w:t xml:space="preserve">10. Зыков С. В. Программирование: учебник и практикум для вузов. — 2-е изд., перераб. и доп. — М.: Юрайт, 2025. — 285 с. — ISBN 978-5-534-16031-4. — URL: </w:t>
+      </w:r>
+      <w:hyperlink r:id="rId12">
+        <w:r>
+          <w:rPr>
+            <w:rStyle w:val="Hyperlink"/>
+            <w:rFonts w:ascii="Times New Roman" w:hAnsi="Times New Roman" w:cs="Times New Roman" w:eastAsia="Times New Roman"/>
+            <w:sz w:val="28"/>
+            <w:szCs w:val="28"/>
+            <w:color w:val="0563C1"/>
+            <w:u w:val="single"/>
+          </w:rPr>
+          <w:t xml:space="preserve">https://urait.ru/bcode/560815</w:t>
+        </w:r>
+      </w:hyperlink>
+      <w:r>
+        <w:rPr>
+          <w:rFonts w:ascii="Times New Roman" w:hAnsi="Times New Roman" w:cs="Times New Roman" w:eastAsia="Times New Roman"/>
+          <w:b w:val="0"/>
+          <w:color w:val="000000"/>
+          <w:sz w:val="28"/>
+        </w:rPr>
+        <w:t>.</w:t>
       </w:r>
     </w:p>
     <w:p>
@@ -286,7 +374,29 @@
           <w:color w:val="000000"/>
           <w:sz w:val="28"/>
         </w:rPr>
-        <w:t>17. Тузовский А. Ф. Проектирование и разработка web-приложений: учебное пособие для среднего профессионального образования. — М.: Юрайт, 2024. — 219 с. — URL: https://urait.ru/bcode/541917 (дата обращения: 03.05.2026).</w:t>
+        <w:t xml:space="preserve">17. Тузовский А. Ф. Проектирование и разработка web-приложений: учебное пособие для среднего профессионального образования. — М.: Юрайт, 2024. — 219 с. — URL: </w:t>
+      </w:r>
+      <w:hyperlink r:id="rId13">
+        <w:r>
+          <w:rPr>
+            <w:rStyle w:val="Hyperlink"/>
+            <w:rFonts w:ascii="Times New Roman" w:hAnsi="Times New Roman" w:cs="Times New Roman" w:eastAsia="Times New Roman"/>
+            <w:sz w:val="28"/>
+            <w:szCs w:val="28"/>
+            <w:color w:val="0563C1"/>
+            <w:u w:val="single"/>
+          </w:rPr>
+          <w:t xml:space="preserve">https://urait.ru/bcode/541917</w:t>
+        </w:r>
+      </w:hyperlink>
+      <w:r>
+        <w:rPr>
+          <w:rFonts w:ascii="Times New Roman" w:hAnsi="Times New Roman" w:cs="Times New Roman" w:eastAsia="Times New Roman"/>
+          <w:b w:val="0"/>
+          <w:color w:val="000000"/>
+          <w:sz w:val="28"/>
+        </w:rPr>
+        <w:t>.</w:t>
       </w:r>
     </w:p>
     <w:p>
@@ -414,7 +524,29 @@
           <w:color w:val="000000"/>
           <w:sz w:val="28"/>
         </w:rPr>
-        <w:t>25. Express.js: официальная документация. — URL: https://expressjs.com/ (дата обращения: 09.05.2026). — Текст: электронный.</w:t>
+        <w:t xml:space="preserve">25. Express.js: официальная документация. — Текст: электронный. — URL: </w:t>
+      </w:r>
+      <w:hyperlink r:id="rId14">
+        <w:r>
+          <w:rPr>
+            <w:rStyle w:val="Hyperlink"/>
+            <w:rFonts w:ascii="Times New Roman" w:hAnsi="Times New Roman" w:cs="Times New Roman" w:eastAsia="Times New Roman"/>
+            <w:sz w:val="28"/>
+            <w:szCs w:val="28"/>
+            <w:color w:val="0563C1"/>
+            <w:u w:val="single"/>
+          </w:rPr>
+          <w:t xml:space="preserve">https://expressjs.com/</w:t>
+        </w:r>
+      </w:hyperlink>
+      <w:r>
+        <w:rPr>
+          <w:rFonts w:ascii="Times New Roman" w:hAnsi="Times New Roman" w:cs="Times New Roman" w:eastAsia="Times New Roman"/>
+          <w:b w:val="0"/>
+          <w:color w:val="000000"/>
+          <w:sz w:val="28"/>
+        </w:rPr>
+        <w:t>.</w:t>
       </w:r>
     </w:p>
     <w:p>
@@ -430,7 +562,29 @@
           <w:color w:val="000000"/>
           <w:sz w:val="28"/>
         </w:rPr>
-        <w:t>26. GitHub. Документация по Git и GitHub. — URL: https://github.com/ (дата обращения: 15.05.2026). — Текст: электронный.</w:t>
+        <w:t xml:space="preserve">26. GitHub. Документация по Git и GitHub. — Текст: электронный. — URL: </w:t>
+      </w:r>
+      <w:hyperlink r:id="rId15">
+        <w:r>
+          <w:rPr>
+            <w:rStyle w:val="Hyperlink"/>
+            <w:rFonts w:ascii="Times New Roman" w:hAnsi="Times New Roman" w:cs="Times New Roman" w:eastAsia="Times New Roman"/>
+            <w:sz w:val="28"/>
+            <w:szCs w:val="28"/>
+            <w:color w:val="0563C1"/>
+            <w:u w:val="single"/>
+          </w:rPr>
+          <w:t xml:space="preserve">https://github.com/</w:t>
+        </w:r>
+      </w:hyperlink>
+      <w:r>
+        <w:rPr>
+          <w:rFonts w:ascii="Times New Roman" w:hAnsi="Times New Roman" w:cs="Times New Roman" w:eastAsia="Times New Roman"/>
+          <w:b w:val="0"/>
+          <w:color w:val="000000"/>
+          <w:sz w:val="28"/>
+        </w:rPr>
+        <w:t>.</w:t>
       </w:r>
     </w:p>
     <w:p>
@@ -446,7 +600,29 @@
           <w:color w:val="000000"/>
           <w:sz w:val="28"/>
         </w:rPr>
-        <w:t>27. GSAP (GreenSock Animation Platform): официальная документация. — URL: https://gsap.com/docs/ (дата обращения: 07.05.2026). — Текст: электронный.</w:t>
+        <w:t xml:space="preserve">27. GSAP (GreenSock Animation Platform): официальная документация. — Текст: электронный. — URL: </w:t>
+      </w:r>
+      <w:hyperlink r:id="rId16">
+        <w:r>
+          <w:rPr>
+            <w:rStyle w:val="Hyperlink"/>
+            <w:rFonts w:ascii="Times New Roman" w:hAnsi="Times New Roman" w:cs="Times New Roman" w:eastAsia="Times New Roman"/>
+            <w:sz w:val="28"/>
+            <w:szCs w:val="28"/>
+            <w:color w:val="0563C1"/>
+            <w:u w:val="single"/>
+          </w:rPr>
+          <w:t xml:space="preserve">https://gsap.com/docs/</w:t>
+        </w:r>
+      </w:hyperlink>
+      <w:r>
+        <w:rPr>
+          <w:rFonts w:ascii="Times New Roman" w:hAnsi="Times New Roman" w:cs="Times New Roman" w:eastAsia="Times New Roman"/>
+          <w:b w:val="0"/>
+          <w:color w:val="000000"/>
+          <w:sz w:val="28"/>
+        </w:rPr>
+        <w:t>.</w:t>
       </w:r>
     </w:p>
     <w:p>
@@ -462,7 +638,29 @@
           <w:color w:val="000000"/>
           <w:sz w:val="28"/>
         </w:rPr>
-        <w:t>28. MySQL: официальная документация. — URL: https://dev.mysql.com/doc/ (дата обращения: 11.05.2026). — Текст: электронный.</w:t>
+        <w:t xml:space="preserve">28. MySQL: официальная документация. — Текст: электронный. — URL: </w:t>
+      </w:r>
+      <w:hyperlink r:id="rId17">
+        <w:r>
+          <w:rPr>
+            <w:rStyle w:val="Hyperlink"/>
+            <w:rFonts w:ascii="Times New Roman" w:hAnsi="Times New Roman" w:cs="Times New Roman" w:eastAsia="Times New Roman"/>
+            <w:sz w:val="28"/>
+            <w:szCs w:val="28"/>
+            <w:color w:val="0563C1"/>
+            <w:u w:val="single"/>
+          </w:rPr>
+          <w:t xml:space="preserve">https://dev.mysql.com/doc/</w:t>
+        </w:r>
+      </w:hyperlink>
+      <w:r>
+        <w:rPr>
+          <w:rFonts w:ascii="Times New Roman" w:hAnsi="Times New Roman" w:cs="Times New Roman" w:eastAsia="Times New Roman"/>
+          <w:b w:val="0"/>
+          <w:color w:val="000000"/>
+          <w:sz w:val="28"/>
+        </w:rPr>
+        <w:t>.</w:t>
       </w:r>
     </w:p>
     <w:p>
@@ -478,7 +676,29 @@
           <w:color w:val="000000"/>
           <w:sz w:val="28"/>
         </w:rPr>
-        <w:t>29. Node.js: официальная документация. — URL: https://nodejs.org/docs/ (дата обращения: 10.05.2026). — Текст: электронный.</w:t>
+        <w:t xml:space="preserve">29. Node.js: официальная документация. — Текст: электронный. — URL: </w:t>
+      </w:r>
+      <w:hyperlink r:id="rId18">
+        <w:r>
+          <w:rPr>
+            <w:rStyle w:val="Hyperlink"/>
+            <w:rFonts w:ascii="Times New Roman" w:hAnsi="Times New Roman" w:cs="Times New Roman" w:eastAsia="Times New Roman"/>
+            <w:sz w:val="28"/>
+            <w:szCs w:val="28"/>
+            <w:color w:val="0563C1"/>
+            <w:u w:val="single"/>
+          </w:rPr>
+          <w:t xml:space="preserve">https://nodejs.org/docs/</w:t>
+        </w:r>
+      </w:hyperlink>
+      <w:r>
+        <w:rPr>
+          <w:rFonts w:ascii="Times New Roman" w:hAnsi="Times New Roman" w:cs="Times New Roman" w:eastAsia="Times New Roman"/>
+          <w:b w:val="0"/>
+          <w:color w:val="000000"/>
+          <w:sz w:val="28"/>
+        </w:rPr>
+        <w:t>.</w:t>
       </w:r>
     </w:p>
     <w:p>
@@ -494,7 +714,29 @@
           <w:color w:val="000000"/>
           <w:sz w:val="28"/>
         </w:rPr>
-        <w:t>30. OWASP Top 10: 2021. — URL: https://owasp.org/Top10/ (дата обращения: 13.05.2026). — Текст: электронный.</w:t>
+        <w:t xml:space="preserve">30. OWASP Top 10: 2021. — Текст: электронный. — URL: </w:t>
+      </w:r>
+      <w:hyperlink r:id="rId19">
+        <w:r>
+          <w:rPr>
+            <w:rStyle w:val="Hyperlink"/>
+            <w:rFonts w:ascii="Times New Roman" w:hAnsi="Times New Roman" w:cs="Times New Roman" w:eastAsia="Times New Roman"/>
+            <w:sz w:val="28"/>
+            <w:szCs w:val="28"/>
+            <w:color w:val="0563C1"/>
+            <w:u w:val="single"/>
+          </w:rPr>
+          <w:t xml:space="preserve">https://owasp.org/Top10/</w:t>
+        </w:r>
+      </w:hyperlink>
+      <w:r>
+        <w:rPr>
+          <w:rFonts w:ascii="Times New Roman" w:hAnsi="Times New Roman" w:cs="Times New Roman" w:eastAsia="Times New Roman"/>
+          <w:b w:val="0"/>
+          <w:color w:val="000000"/>
+          <w:sz w:val="28"/>
+        </w:rPr>
+        <w:t>.</w:t>
       </w:r>
     </w:p>
     <w:p>
@@ -510,7 +752,29 @@
           <w:color w:val="000000"/>
           <w:sz w:val="28"/>
         </w:rPr>
-        <w:t>31. Three.js — JavaScript-библиотека для построения 3D-графики на основе WebGL: официальная документация. — URL: https://threejs.org/docs/ (дата обращения: 07.05.2026). — Текст: электронный.</w:t>
+        <w:t xml:space="preserve">31. Three.js — JavaScript-библиотека для построения 3D-графики на основе WebGL: официальная документация. — Текст: электронный. — URL: </w:t>
+      </w:r>
+      <w:hyperlink r:id="rId20">
+        <w:r>
+          <w:rPr>
+            <w:rStyle w:val="Hyperlink"/>
+            <w:rFonts w:ascii="Times New Roman" w:hAnsi="Times New Roman" w:cs="Times New Roman" w:eastAsia="Times New Roman"/>
+            <w:sz w:val="28"/>
+            <w:szCs w:val="28"/>
+            <w:color w:val="0563C1"/>
+            <w:u w:val="single"/>
+          </w:rPr>
+          <w:t xml:space="preserve">https://threejs.org/docs/</w:t>
+        </w:r>
+      </w:hyperlink>
+      <w:r>
+        <w:rPr>
+          <w:rFonts w:ascii="Times New Roman" w:hAnsi="Times New Roman" w:cs="Times New Roman" w:eastAsia="Times New Roman"/>
+          <w:b w:val="0"/>
+          <w:color w:val="000000"/>
+          <w:sz w:val="28"/>
+        </w:rPr>
+        <w:t>.</w:t>
       </w:r>
     </w:p>
     <w:p>
@@ -526,7 +790,29 @@
           <w:color w:val="000000"/>
           <w:sz w:val="28"/>
         </w:rPr>
-        <w:t>32. W3C. World Wide Web Consortium: стандарты HTML и CSS. — URL: https://www.w3.org/ (дата обращения: 14.05.2026). — Текст: электронный.</w:t>
+        <w:t xml:space="preserve">32. W3C. World Wide Web Consortium: стандарты HTML и CSS. — Текст: электронный. — URL: </w:t>
+      </w:r>
+      <w:hyperlink r:id="rId21">
+        <w:r>
+          <w:rPr>
+            <w:rStyle w:val="Hyperlink"/>
+            <w:rFonts w:ascii="Times New Roman" w:hAnsi="Times New Roman" w:cs="Times New Roman" w:eastAsia="Times New Roman"/>
+            <w:sz w:val="28"/>
+            <w:szCs w:val="28"/>
+            <w:color w:val="0563C1"/>
+            <w:u w:val="single"/>
+          </w:rPr>
+          <w:t xml:space="preserve">https://www.w3.org/</w:t>
+        </w:r>
+      </w:hyperlink>
+      <w:r>
+        <w:rPr>
+          <w:rFonts w:ascii="Times New Roman" w:hAnsi="Times New Roman" w:cs="Times New Roman" w:eastAsia="Times New Roman"/>
+          <w:b w:val="0"/>
+          <w:color w:val="000000"/>
+          <w:sz w:val="28"/>
+        </w:rPr>
+        <w:t>.</w:t>
       </w:r>
     </w:p>
     <w:p>
@@ -542,7 +828,29 @@
           <w:color w:val="000000"/>
           <w:sz w:val="28"/>
         </w:rPr>
-        <w:t>33. Web Push Protocol (RFC 8030). — URL: https://datatracker.ietf.org/doc/html/rfc8030 (дата обращения: 12.05.2026). — Текст: электронный.</w:t>
+        <w:t xml:space="preserve">33. Web Push Protocol (RFC 8030). — Текст: электронный. — URL: </w:t>
+      </w:r>
+      <w:hyperlink r:id="rId22">
+        <w:r>
+          <w:rPr>
+            <w:rStyle w:val="Hyperlink"/>
+            <w:rFonts w:ascii="Times New Roman" w:hAnsi="Times New Roman" w:cs="Times New Roman" w:eastAsia="Times New Roman"/>
+            <w:sz w:val="28"/>
+            <w:szCs w:val="28"/>
+            <w:color w:val="0563C1"/>
+            <w:u w:val="single"/>
+          </w:rPr>
+          <w:t xml:space="preserve">https://datatracker.ietf.org/doc/html/rfc8030</w:t>
+        </w:r>
+      </w:hyperlink>
+      <w:r>
+        <w:rPr>
+          <w:rFonts w:ascii="Times New Roman" w:hAnsi="Times New Roman" w:cs="Times New Roman" w:eastAsia="Times New Roman"/>
+          <w:b w:val="0"/>
+          <w:color w:val="000000"/>
+          <w:sz w:val="28"/>
+        </w:rPr>
+        <w:t>.</w:t>
       </w:r>
     </w:p>
     <w:sectPr>
@@ -918,10 +1226,6 @@
     <w:name w:val="Normal"/>
     <w:qFormat/>
     <w:rsid w:val="00FC693F"/>
-    <w:rPr>
-      <w:rFonts w:ascii="Times New Roman" w:hAnsi="Times New Roman" w:cs="Times New Roman" w:eastAsia="Times New Roman"/>
-      <w:sz w:val="28"/>
-    </w:rPr>
   </w:style>
   <w:style w:type="paragraph" w:styleId="Header">
     <w:name w:val="header"/>

</xml_diff>

<commit_message>
docs: reorder sources — ФЗ first, then ГОСТы, then alphabetical
https://claude.ai/code/session_01WBcR9y3fb3gMXiFrPhvoBr
</commit_message>
<xml_diff>
--- a/docs/reports/Список_источников_РЕМНАНТ.docx
+++ b/docs/reports/Список_источников_РЕМНАНТ.docx
@@ -30,7 +30,87 @@
           <w:color w:val="000000"/>
           <w:sz w:val="28"/>
         </w:rPr>
-        <w:t xml:space="preserve">1. Бейтс М. CoffeeScript. Второе дыхание JavaScript: практическое руководство. — М.: ДМК Пресс, 2023. — 311 с. — ISBN 978-5-89818-581-7. — URL: </w:t>
+        <w:t>1. Федеральный закон от 27.07.2006 № 149-ФЗ «Об информации, информационных технологиях и о защите информации».</w:t>
+      </w:r>
+    </w:p>
+    <w:p>
+      <w:pPr>
+        <w:spacing w:line="360" w:lineRule="auto" w:after="0"/>
+        <w:ind w:firstLine="709"/>
+        <w:jc w:val="both"/>
+      </w:pPr>
+      <w:r>
+        <w:rPr>
+          <w:rFonts w:ascii="Times New Roman" w:hAnsi="Times New Roman" w:cs="Times New Roman" w:eastAsia="Times New Roman"/>
+          <w:b w:val="0"/>
+          <w:color w:val="000000"/>
+          <w:sz w:val="28"/>
+        </w:rPr>
+        <w:t>2. ГОСТ 19.101-77. Единая система программной документации. Общие положения. — М.: Стандарты, 2006.</w:t>
+      </w:r>
+    </w:p>
+    <w:p>
+      <w:pPr>
+        <w:spacing w:line="360" w:lineRule="auto" w:after="0"/>
+        <w:ind w:firstLine="709"/>
+        <w:jc w:val="both"/>
+      </w:pPr>
+      <w:r>
+        <w:rPr>
+          <w:rFonts w:ascii="Times New Roman" w:hAnsi="Times New Roman" w:cs="Times New Roman" w:eastAsia="Times New Roman"/>
+          <w:b w:val="0"/>
+          <w:color w:val="000000"/>
+          <w:sz w:val="28"/>
+        </w:rPr>
+        <w:t>3. ГОСТ Р 34.11-2012. Информационная технология. Криптографическая защита информации. Хеш-функция. — М.: Изд-во стандартов, 2013. — 56 с.</w:t>
+      </w:r>
+    </w:p>
+    <w:p>
+      <w:pPr>
+        <w:spacing w:line="360" w:lineRule="auto" w:after="0"/>
+        <w:ind w:firstLine="709"/>
+        <w:jc w:val="both"/>
+      </w:pPr>
+      <w:r>
+        <w:rPr>
+          <w:rFonts w:ascii="Times New Roman" w:hAnsi="Times New Roman" w:cs="Times New Roman" w:eastAsia="Times New Roman"/>
+          <w:b w:val="0"/>
+          <w:color w:val="000000"/>
+          <w:sz w:val="28"/>
+        </w:rPr>
+        <w:t>4. ГОСТ Р 7.0.8-2013. Системы обработки информации. Основные положения. — М.: Стандартинформ, 2014.</w:t>
+      </w:r>
+    </w:p>
+    <w:p>
+      <w:pPr>
+        <w:spacing w:line="360" w:lineRule="auto" w:after="0"/>
+        <w:ind w:firstLine="709"/>
+        <w:jc w:val="both"/>
+      </w:pPr>
+      <w:r>
+        <w:rPr>
+          <w:rFonts w:ascii="Times New Roman" w:hAnsi="Times New Roman" w:cs="Times New Roman" w:eastAsia="Times New Roman"/>
+          <w:b w:val="0"/>
+          <w:color w:val="000000"/>
+          <w:sz w:val="28"/>
+        </w:rPr>
+        <w:t>5. ГОСТ Р ИСО/МЭК 17799-2005. Информационная технология. — М.: Стандартинформ, 2006.</w:t>
+      </w:r>
+    </w:p>
+    <w:p>
+      <w:pPr>
+        <w:spacing w:line="360" w:lineRule="auto" w:after="0"/>
+        <w:ind w:firstLine="709"/>
+        <w:jc w:val="both"/>
+      </w:pPr>
+      <w:r>
+        <w:rPr>
+          <w:rFonts w:ascii="Times New Roman" w:hAnsi="Times New Roman" w:cs="Times New Roman" w:eastAsia="Times New Roman"/>
+          <w:b w:val="0"/>
+          <w:color w:val="000000"/>
+          <w:sz w:val="28"/>
+        </w:rPr>
+        <w:t xml:space="preserve">6. Бейтс М. CoffeeScript. Второе дыхание JavaScript: практическое руководство. — М.: ДМК Пресс, 2023. — 311 с. — ISBN 978-5-89818-581-7. — URL: </w:t>
       </w:r>
       <w:hyperlink r:id="rId9">
         <w:r>
@@ -68,7 +148,7 @@
           <w:color w:val="000000"/>
           <w:sz w:val="28"/>
         </w:rPr>
-        <w:t xml:space="preserve">2. Гладкий А. А. Веб-самоделкин. Как самому создать сайт быстро и профессионально: практическое руководство. — М.: Директ-Медиа, 2020. — 265 с. — ISBN 978-5-4499-1220-6. — URL: </w:t>
+        <w:t xml:space="preserve">7. Гладкий А. А. Веб-самоделкин. Как самому создать сайт быстро и профессионально: практическое руководство. — М.: Директ-Медиа, 2020. — 265 с. — ISBN 978-5-4499-1220-6. — URL: </w:t>
       </w:r>
       <w:hyperlink r:id="rId10">
         <w:r>
@@ -106,7 +186,7 @@
           <w:color w:val="000000"/>
           <w:sz w:val="28"/>
         </w:rPr>
-        <w:t>3. ГОСТ 19.101-77. Единая система программной документации. Общие положения. — М.: Стандарты, 2006.</w:t>
+        <w:t>8. Дакетт Д. JavaScript и jQuery. Интерактивная веб-разработка. — М.: Эксмо, 2022. — 640 с.</w:t>
       </w:r>
     </w:p>
     <w:p>
@@ -122,71 +202,7 @@
           <w:color w:val="000000"/>
           <w:sz w:val="28"/>
         </w:rPr>
-        <w:t>4. ГОСТ Р 34.11-2012. Информационная технология. Криптографическая защита информации. Хеш-функция. — М.: Изд-во стандартов, 2013. — 56 с.</w:t>
-      </w:r>
-    </w:p>
-    <w:p>
-      <w:pPr>
-        <w:spacing w:line="360" w:lineRule="auto" w:after="0"/>
-        <w:ind w:firstLine="709"/>
-        <w:jc w:val="both"/>
-      </w:pPr>
-      <w:r>
-        <w:rPr>
-          <w:rFonts w:ascii="Times New Roman" w:hAnsi="Times New Roman" w:cs="Times New Roman" w:eastAsia="Times New Roman"/>
-          <w:b w:val="0"/>
-          <w:color w:val="000000"/>
-          <w:sz w:val="28"/>
-        </w:rPr>
-        <w:t>5. ГОСТ Р 7.0.8-2013. Системы обработки информации. Основные положения. — М.: Стандартинформ, 2014.</w:t>
-      </w:r>
-    </w:p>
-    <w:p>
-      <w:pPr>
-        <w:spacing w:line="360" w:lineRule="auto" w:after="0"/>
-        <w:ind w:firstLine="709"/>
-        <w:jc w:val="both"/>
-      </w:pPr>
-      <w:r>
-        <w:rPr>
-          <w:rFonts w:ascii="Times New Roman" w:hAnsi="Times New Roman" w:cs="Times New Roman" w:eastAsia="Times New Roman"/>
-          <w:b w:val="0"/>
-          <w:color w:val="000000"/>
-          <w:sz w:val="28"/>
-        </w:rPr>
-        <w:t>6. ГОСТ Р ИСО/МЭК 17799-2005. Информационная технология. — М.: Стандартинформ, 2006.</w:t>
-      </w:r>
-    </w:p>
-    <w:p>
-      <w:pPr>
-        <w:spacing w:line="360" w:lineRule="auto" w:after="0"/>
-        <w:ind w:firstLine="709"/>
-        <w:jc w:val="both"/>
-      </w:pPr>
-      <w:r>
-        <w:rPr>
-          <w:rFonts w:ascii="Times New Roman" w:hAnsi="Times New Roman" w:cs="Times New Roman" w:eastAsia="Times New Roman"/>
-          <w:b w:val="0"/>
-          <w:color w:val="000000"/>
-          <w:sz w:val="28"/>
-        </w:rPr>
-        <w:t>7. Дакетт Д. JavaScript и jQuery. Интерактивная веб-разработка. — М.: Эксмо, 2022. — 640 с.</w:t>
-      </w:r>
-    </w:p>
-    <w:p>
-      <w:pPr>
-        <w:spacing w:line="360" w:lineRule="auto" w:after="0"/>
-        <w:ind w:firstLine="709"/>
-        <w:jc w:val="both"/>
-      </w:pPr>
-      <w:r>
-        <w:rPr>
-          <w:rFonts w:ascii="Times New Roman" w:hAnsi="Times New Roman" w:cs="Times New Roman" w:eastAsia="Times New Roman"/>
-          <w:b w:val="0"/>
-          <w:color w:val="000000"/>
-          <w:sz w:val="28"/>
-        </w:rPr>
-        <w:t xml:space="preserve">8. Дронов В. А. HTML 5, CSS 3 и Web 2.0. Разработка современных веб-сайтов. — СПб.: БХВ-Петербург, 2020. — 408 с. — URL: </w:t>
+        <w:t xml:space="preserve">9. Дронов В. А. HTML 5, CSS 3 и Web 2.0. Разработка современных веб-сайтов. — СПб.: БХВ-Петербург, 2020. — 408 с. — URL: </w:t>
       </w:r>
       <w:hyperlink r:id="rId11">
         <w:r>
@@ -224,7 +240,7 @@
           <w:color w:val="000000"/>
           <w:sz w:val="28"/>
         </w:rPr>
-        <w:t>9. Зенков А. В. Информационная безопасность и защита информации: учебник для вузов. — 2-е изд., перераб. и доп. — М.: Юрайт, 2025. — 107 с. — ISBN 978-5-534-16388-9.</w:t>
+        <w:t>10. Зенков А. В. Информационная безопасность и защита информации: учебник для вузов. — 2-е изд., перераб. и доп. — М.: Юрайт, 2025. — 107 с. — ISBN 978-5-534-16388-9.</w:t>
       </w:r>
     </w:p>
     <w:p>
@@ -240,7 +256,7 @@
           <w:color w:val="000000"/>
           <w:sz w:val="28"/>
         </w:rPr>
-        <w:t xml:space="preserve">10. Зыков С. В. Программирование: учебник и практикум для вузов. — 2-е изд., перераб. и доп. — М.: Юрайт, 2025. — 285 с. — ISBN 978-5-534-16031-4. — URL: </w:t>
+        <w:t xml:space="preserve">11. Зыков С. В. Программирование: учебник и практикум для вузов. — 2-е изд., перераб. и доп. — М.: Юрайт, 2025. — 285 с. — ISBN 978-5-534-16031-4. — URL: </w:t>
       </w:r>
       <w:hyperlink r:id="rId12">
         <w:r>
@@ -278,7 +294,7 @@
           <w:color w:val="000000"/>
           <w:sz w:val="28"/>
         </w:rPr>
-        <w:t>11. Лион У. Разработка веб-приложений GraphQL с React, Node.js и Neo4j: практическое руководство. — М.: ДМК Пресс, 2023. — 264 с. — ISBN 978-5-93700-185-6.</w:t>
+        <w:t>12. Лион У. Разработка веб-приложений GraphQL с React, Node.js и Neo4j: практическое руководство. — М.: ДМК Пресс, 2023. — 264 с. — ISBN 978-5-93700-185-6.</w:t>
       </w:r>
     </w:p>
     <w:p>
@@ -294,7 +310,7 @@
           <w:color w:val="000000"/>
           <w:sz w:val="28"/>
         </w:rPr>
-        <w:t>12. Мартишин С. А. Базы данных. Практическое применение СУБД SQL и NoSQL-типа: учебное пособие. — М.: ДМК Пресс, 2023. — 454 с. — ISBN 978-5-8199-0946-1.</w:t>
+        <w:t>13. Мартишин С. А. Базы данных. Практическое применение СУБД SQL и NoSQL-типа: учебное пособие. — М.: ДМК Пресс, 2023. — 454 с. — ISBN 978-5-8199-0946-1.</w:t>
       </w:r>
     </w:p>
     <w:p>
@@ -310,7 +326,7 @@
           <w:color w:val="000000"/>
           <w:sz w:val="28"/>
         </w:rPr>
-        <w:t>13. Мартишин С. А. Базы данных: работа с распределёнными базами данных и файловыми системами на примере MongoDB и HDFS с использованием Node.js, Express.js, Apache Spark и Scala. — М.: НИЦ ИНФРА-М, 2024. — 235 с. — ISBN 978-5-16-019912-2.</w:t>
+        <w:t>14. Мартишин С. А. Базы данных: работа с распределёнными базами данных и файловыми системами на примере MongoDB и HDFS с использованием Node.js, Express.js, Apache Spark и Scala. — М.: НИЦ ИНФРА-М, 2024. — 235 с. — ISBN 978-5-16-019912-2.</w:t>
       </w:r>
     </w:p>
     <w:p>
@@ -326,7 +342,7 @@
           <w:color w:val="000000"/>
           <w:sz w:val="28"/>
         </w:rPr>
-        <w:t>14. Панфилов К. С. Создание веб-сайта от замысла до реализации: практическое руководство. — М.: ДМК Пресс, 2023. — 438 с. — ISBN 978-5-89818-476-6.</w:t>
+        <w:t>15. Панфилов К. С. Создание веб-сайта от замысла до реализации: практическое руководство. — М.: ДМК Пресс, 2023. — 438 с. — ISBN 978-5-89818-476-6.</w:t>
       </w:r>
     </w:p>
     <w:p>
@@ -342,7 +358,7 @@
           <w:color w:val="000000"/>
           <w:sz w:val="28"/>
         </w:rPr>
-        <w:t>15. Полуэктова Н. Р. Разработка веб-приложений: учебник для вузов. — 2-е изд. — М.: Юрайт, 2025. — 204 с. — ISBN 978-5-534-18645-1.</w:t>
+        <w:t>16. Полуэктова Н. Р. Разработка веб-приложений: учебник для вузов. — 2-е изд. — М.: Юрайт, 2025. — 204 с. — ISBN 978-5-534-18645-1.</w:t>
       </w:r>
     </w:p>
     <w:p>
@@ -358,7 +374,7 @@
           <w:color w:val="000000"/>
           <w:sz w:val="28"/>
         </w:rPr>
-        <w:t>16. Сухов К. К. Node.js. Путеводитель по технологии: практическое руководство. — 2-е изд. — М.: ДМК Пресс, 2023. — 417 с. — ISBN 978-5-89818-328-8.</w:t>
+        <w:t>17. Сухов К. К. Node.js. Путеводитель по технологии: практическое руководство. — 2-е изд. — М.: ДМК Пресс, 2023. — 417 с. — ISBN 978-5-89818-328-8.</w:t>
       </w:r>
     </w:p>
     <w:p>
@@ -374,7 +390,7 @@
           <w:color w:val="000000"/>
           <w:sz w:val="28"/>
         </w:rPr>
-        <w:t xml:space="preserve">17. Тузовский А. Ф. Проектирование и разработка web-приложений: учебное пособие для среднего профессионального образования. — М.: Юрайт, 2024. — 219 с. — URL: </w:t>
+        <w:t xml:space="preserve">18. Тузовский А. Ф. Проектирование и разработка web-приложений: учебное пособие для среднего профессионального образования. — М.: Юрайт, 2024. — 219 с. — URL: </w:t>
       </w:r>
       <w:hyperlink r:id="rId13">
         <w:r>
@@ -397,22 +413,6 @@
           <w:sz w:val="28"/>
         </w:rPr>
         <w:t>.</w:t>
-      </w:r>
-    </w:p>
-    <w:p>
-      <w:pPr>
-        <w:spacing w:line="360" w:lineRule="auto" w:after="0"/>
-        <w:ind w:firstLine="709"/>
-        <w:jc w:val="both"/>
-      </w:pPr>
-      <w:r>
-        <w:rPr>
-          <w:rFonts w:ascii="Times New Roman" w:hAnsi="Times New Roman" w:cs="Times New Roman" w:eastAsia="Times New Roman"/>
-          <w:b w:val="0"/>
-          <w:color w:val="000000"/>
-          <w:sz w:val="28"/>
-        </w:rPr>
-        <w:t>18. Федеральный закон от 27.07.2006 № 149-ФЗ «Об информации, информационных технологиях и о защите информации».</w:t>
       </w:r>
     </w:p>
     <w:p>

</xml_diff>

<commit_message>
docs: replace sources with user-provided list, 20 entries, alphabetical
ФЗ → ГОСТы (по номеру) → книги по алфавиту, синие гиперссылки на
知anium/garant, без дат обращения.

https://claude.ai/code/session_01WBcR9y3fb3gMXiFrPhvoBr
</commit_message>
<xml_diff>
--- a/docs/reports/Список_источников_РЕМНАНТ.docx
+++ b/docs/reports/Список_источников_РЕМНАНТ.docx
@@ -30,7 +30,35 @@
           <w:color w:val="000000"/>
           <w:sz w:val="28"/>
         </w:rPr>
-        <w:t>1. Федеральный закон от 27.07.2006 № 149-ФЗ «Об информации, информационных технологиях и о защите информации».</w:t>
+        <w:t xml:space="preserve">1. Федеральный закон от 27.07.2006 № 149-ФЗ «Об информации, информационных технологиях и о защите информации». — Режим доступа: свободный. — URL: </w:t>
+      </w:r>
+      <w:hyperlink r:id="rId9">
+        <w:r>
+          <w:rPr>
+            <w:rFonts w:ascii="Times New Roman" w:hAnsi="Times New Roman" w:cs="Times New Roman" w:eastAsia="Times New Roman"/>
+            <w:sz w:val="28"/>
+            <w:szCs w:val="28"/>
+            <w:color w:val="0563C1"/>
+            <w:u w:val="single"/>
+          </w:rPr>
+          <w:t xml:space="preserve">https://base.garant.ru/12148555/</w:t>
+        </w:r>
+      </w:hyperlink>
+    </w:p>
+    <w:p>
+      <w:pPr>
+        <w:spacing w:line="360" w:lineRule="auto" w:after="0"/>
+        <w:ind w:firstLine="709"/>
+        <w:jc w:val="both"/>
+      </w:pPr>
+      <w:r>
+        <w:rPr>
+          <w:rFonts w:ascii="Times New Roman" w:hAnsi="Times New Roman" w:cs="Times New Roman" w:eastAsia="Times New Roman"/>
+          <w:b w:val="0"/>
+          <w:color w:val="000000"/>
+          <w:sz w:val="28"/>
+        </w:rPr>
+        <w:t>2. ГОСТ 19.101-77. Единая система программной документации (ЕСПД). Общие положения. — М.: Изд-во стандартов, 2006.</w:t>
       </w:r>
     </w:p>
     <w:p>
@@ -46,7 +74,7 @@
           <w:color w:val="000000"/>
           <w:sz w:val="28"/>
         </w:rPr>
-        <w:t>2. ГОСТ 19.101-77. Единая система программной документации. Общие положения. — М.: Стандарты, 2006.</w:t>
+        <w:t>3. ГОСТ 34.601-90. Информационная технология. Автоматизированные системы. Стадии создания.</w:t>
       </w:r>
     </w:p>
     <w:p>
@@ -62,7 +90,7 @@
           <w:color w:val="000000"/>
           <w:sz w:val="28"/>
         </w:rPr>
-        <w:t>3. ГОСТ Р 34.11-2012. Информационная технология. Криптографическая защита информации. Хеш-функция. — М.: Изд-во стандартов, 2013. — 56 с.</w:t>
+        <w:t>4. ГОСТ 34.602-89. Информационная технология. Техническое задание на создание автоматизированной системы.</w:t>
       </w:r>
     </w:p>
     <w:p>
@@ -78,7 +106,7 @@
           <w:color w:val="000000"/>
           <w:sz w:val="28"/>
         </w:rPr>
-        <w:t>4. ГОСТ Р 7.0.8-2013. Системы обработки информации. Основные положения. — М.: Стандартинформ, 2014.</w:t>
+        <w:t>5. ГОСТ Р 7.0.8-2013. Национальный стандарт Российской Федерации. Системы обработки информации. Основные положения.</w:t>
       </w:r>
     </w:p>
     <w:p>
@@ -94,8 +122,20 @@
           <w:color w:val="000000"/>
           <w:sz w:val="28"/>
         </w:rPr>
-        <w:t>5. ГОСТ Р ИСО/МЭК 17799-2005. Информационная технология. — М.: Стандартинформ, 2006.</w:t>
+        <w:t xml:space="preserve">6. Бейтс М. CoffeeScript. Второе дыхание JavaScript: практическое руководство / М. Бейтс. — М.: ДМК Пресс, 2023. — 311 с. — Текст: электронный. — URL: </w:t>
       </w:r>
+      <w:hyperlink r:id="rId10">
+        <w:r>
+          <w:rPr>
+            <w:rFonts w:ascii="Times New Roman" w:hAnsi="Times New Roman" w:cs="Times New Roman" w:eastAsia="Times New Roman"/>
+            <w:sz w:val="28"/>
+            <w:szCs w:val="28"/>
+            <w:color w:val="0563C1"/>
+            <w:u w:val="single"/>
+          </w:rPr>
+          <w:t xml:space="preserve">https://znanium.com/catalog/document?id=435452</w:t>
+        </w:r>
+      </w:hyperlink>
     </w:p>
     <w:p>
       <w:pPr>
@@ -110,30 +150,20 @@
           <w:color w:val="000000"/>
           <w:sz w:val="28"/>
         </w:rPr>
-        <w:t xml:space="preserve">6. Бейтс М. CoffeeScript. Второе дыхание JavaScript: практическое руководство. — М.: ДМК Пресс, 2023. — 311 с. — ISBN 978-5-89818-581-7. — URL: </w:t>
+        <w:t xml:space="preserve">7. Дакетт Д. JavaScript и jQuery. Интерактивная веб-разработка / Д. Дакетт. — М.: Эксмо, 2022. — 640 с. — Текст: электронный. — URL: </w:t>
       </w:r>
-      <w:hyperlink r:id="rId9">
+      <w:hyperlink r:id="rId11">
         <w:r>
           <w:rPr>
-            <w:rStyle w:val="Hyperlink"/>
             <w:rFonts w:ascii="Times New Roman" w:hAnsi="Times New Roman" w:cs="Times New Roman" w:eastAsia="Times New Roman"/>
             <w:sz w:val="28"/>
             <w:szCs w:val="28"/>
             <w:color w:val="0563C1"/>
             <w:u w:val="single"/>
           </w:rPr>
-          <w:t xml:space="preserve">https://znanium.ru/catalog/document?id=435452</w:t>
+          <w:t xml:space="preserve">https://znanium.com/catalog/document?id=423558</w:t>
         </w:r>
       </w:hyperlink>
-      <w:r>
-        <w:rPr>
-          <w:rFonts w:ascii="Times New Roman" w:hAnsi="Times New Roman" w:cs="Times New Roman" w:eastAsia="Times New Roman"/>
-          <w:b w:val="0"/>
-          <w:color w:val="000000"/>
-          <w:sz w:val="28"/>
-        </w:rPr>
-        <w:t>.</w:t>
-      </w:r>
     </w:p>
     <w:p>
       <w:pPr>
@@ -148,30 +178,20 @@
           <w:color w:val="000000"/>
           <w:sz w:val="28"/>
         </w:rPr>
-        <w:t xml:space="preserve">7. Гладкий А. А. Веб-самоделкин. Как самому создать сайт быстро и профессионально: практическое руководство. — М.: Директ-Медиа, 2020. — 265 с. — ISBN 978-5-4499-1220-6. — URL: </w:t>
+        <w:t xml:space="preserve">8. Лион У. Разработка веб-приложений GraphQL с React, Node.js и Neo4j / У. Лион. — М.: ДМК Пресс, 2023. — 264 с. — Текст: электронный. — URL: </w:t>
       </w:r>
-      <w:hyperlink r:id="rId10">
+      <w:hyperlink r:id="rId12">
         <w:r>
           <w:rPr>
-            <w:rStyle w:val="Hyperlink"/>
             <w:rFonts w:ascii="Times New Roman" w:hAnsi="Times New Roman" w:cs="Times New Roman" w:eastAsia="Times New Roman"/>
             <w:sz w:val="28"/>
             <w:szCs w:val="28"/>
             <w:color w:val="0563C1"/>
             <w:u w:val="single"/>
           </w:rPr>
-          <w:t xml:space="preserve">https://znanium.ru/catalog/document?id=400321</w:t>
+          <w:t xml:space="preserve">https://znanium.com/catalog/document?id=429181</w:t>
         </w:r>
       </w:hyperlink>
-      <w:r>
-        <w:rPr>
-          <w:rFonts w:ascii="Times New Roman" w:hAnsi="Times New Roman" w:cs="Times New Roman" w:eastAsia="Times New Roman"/>
-          <w:b w:val="0"/>
-          <w:color w:val="000000"/>
-          <w:sz w:val="28"/>
-        </w:rPr>
-        <w:t>.</w:t>
-      </w:r>
     </w:p>
     <w:p>
       <w:pPr>
@@ -186,8 +206,20 @@
           <w:color w:val="000000"/>
           <w:sz w:val="28"/>
         </w:rPr>
-        <w:t>8. Дакетт Д. JavaScript и jQuery. Интерактивная веб-разработка. — М.: Эксмо, 2022. — 640 с.</w:t>
+        <w:t xml:space="preserve">9. Мартишин С. А. Базы данных. Практическое применение СУБД SQL и NoSQL-типа: учебное пособие / С. А. Мартишин. — М.: ДМК Пресс, 2023. — 454 с. — Текст: электронный. — URL: </w:t>
       </w:r>
+      <w:hyperlink r:id="rId13">
+        <w:r>
+          <w:rPr>
+            <w:rFonts w:ascii="Times New Roman" w:hAnsi="Times New Roman" w:cs="Times New Roman" w:eastAsia="Times New Roman"/>
+            <w:sz w:val="28"/>
+            <w:szCs w:val="28"/>
+            <w:color w:val="0563C1"/>
+            <w:u w:val="single"/>
+          </w:rPr>
+          <w:t xml:space="preserve">https://znanium.com/catalog/document?id=415803</w:t>
+        </w:r>
+      </w:hyperlink>
     </w:p>
     <w:p>
       <w:pPr>
@@ -202,30 +234,20 @@
           <w:color w:val="000000"/>
           <w:sz w:val="28"/>
         </w:rPr>
-        <w:t xml:space="preserve">9. Дронов В. А. HTML 5, CSS 3 и Web 2.0. Разработка современных веб-сайтов. — СПб.: БХВ-Петербург, 2020. — 408 с. — URL: </w:t>
+        <w:t xml:space="preserve">10. Мартишин С. А. Базы данных: работа с распределёнными базами данных и файловыми системами на примере MongoDB и HDFS / С. А. Мартишин. — М.: НИЦ ИНФРА-М, 2024. — 235 с. — Текст: электронный. — URL: </w:t>
       </w:r>
-      <w:hyperlink r:id="rId11">
+      <w:hyperlink r:id="rId14">
         <w:r>
           <w:rPr>
-            <w:rStyle w:val="Hyperlink"/>
             <w:rFonts w:ascii="Times New Roman" w:hAnsi="Times New Roman" w:cs="Times New Roman" w:eastAsia="Times New Roman"/>
             <w:sz w:val="28"/>
             <w:szCs w:val="28"/>
             <w:color w:val="0563C1"/>
             <w:u w:val="single"/>
           </w:rPr>
-          <w:t xml:space="preserve">https://www.litres.ru/book/vladimir-dronov/html-5-css-3-i-web-20-razrabotka-sovremennyh-veb-saytov-8559189/</w:t>
+          <w:t xml:space="preserve">https://znanium.com/catalog/document?id=2120091</w:t>
         </w:r>
       </w:hyperlink>
-      <w:r>
-        <w:rPr>
-          <w:rFonts w:ascii="Times New Roman" w:hAnsi="Times New Roman" w:cs="Times New Roman" w:eastAsia="Times New Roman"/>
-          <w:b w:val="0"/>
-          <w:color w:val="000000"/>
-          <w:sz w:val="28"/>
-        </w:rPr>
-        <w:t>.</w:t>
-      </w:r>
     </w:p>
     <w:p>
       <w:pPr>
@@ -240,8 +262,20 @@
           <w:color w:val="000000"/>
           <w:sz w:val="28"/>
         </w:rPr>
-        <w:t>10. Зенков А. В. Информационная безопасность и защита информации: учебник для вузов. — 2-е изд., перераб. и доп. — М.: Юрайт, 2025. — 107 с. — ISBN 978-5-534-16388-9.</w:t>
+        <w:t xml:space="preserve">11. Миковски М. Разработка одностраничных веб-приложений: практическое руководство / М. Миковски, Дж. К. Пауэлл ; пер. с англ. А. А. Слинкина. — 2-е изд. — М.: ДМК Пресс, 2023. — 514 с. — ISBN 978-5-89818-353-0. — Текст: электронный. — URL: </w:t>
       </w:r>
+      <w:hyperlink r:id="rId15">
+        <w:r>
+          <w:rPr>
+            <w:rFonts w:ascii="Times New Roman" w:hAnsi="Times New Roman" w:cs="Times New Roman" w:eastAsia="Times New Roman"/>
+            <w:sz w:val="28"/>
+            <w:szCs w:val="28"/>
+            <w:color w:val="0563C1"/>
+            <w:u w:val="single"/>
+          </w:rPr>
+          <w:t xml:space="preserve">https://znanium.ru/catalog/document?id=435034</w:t>
+        </w:r>
+      </w:hyperlink>
     </w:p>
     <w:p>
       <w:pPr>
@@ -256,30 +290,20 @@
           <w:color w:val="000000"/>
           <w:sz w:val="28"/>
         </w:rPr>
-        <w:t xml:space="preserve">11. Зыков С. В. Программирование: учебник и практикум для вузов. — 2-е изд., перераб. и доп. — М.: Юрайт, 2025. — 285 с. — ISBN 978-5-534-16031-4. — URL: </w:t>
+        <w:t xml:space="preserve">12. Никсон Р. Создаём динамические веб-сайты с помощью PHP, MySQL, JavaScript, CSS и HTML5 / Р. Никсон. — СПб.: Питер, 2022. — 816 с. — Текст: электронный. — URL: </w:t>
       </w:r>
-      <w:hyperlink r:id="rId12">
+      <w:hyperlink r:id="rId16">
         <w:r>
           <w:rPr>
-            <w:rStyle w:val="Hyperlink"/>
             <w:rFonts w:ascii="Times New Roman" w:hAnsi="Times New Roman" w:cs="Times New Roman" w:eastAsia="Times New Roman"/>
             <w:sz w:val="28"/>
             <w:szCs w:val="28"/>
             <w:color w:val="0563C1"/>
             <w:u w:val="single"/>
           </w:rPr>
-          <w:t xml:space="preserve">https://urait.ru/bcode/560815</w:t>
+          <w:t xml:space="preserve">https://znanium.com/catalog/document?id=427801</w:t>
         </w:r>
       </w:hyperlink>
-      <w:r>
-        <w:rPr>
-          <w:rFonts w:ascii="Times New Roman" w:hAnsi="Times New Roman" w:cs="Times New Roman" w:eastAsia="Times New Roman"/>
-          <w:b w:val="0"/>
-          <w:color w:val="000000"/>
-          <w:sz w:val="28"/>
-        </w:rPr>
-        <w:t>.</w:t>
-      </w:r>
     </w:p>
     <w:p>
       <w:pPr>
@@ -294,8 +318,20 @@
           <w:color w:val="000000"/>
           <w:sz w:val="28"/>
         </w:rPr>
-        <w:t>12. Лион У. Разработка веб-приложений GraphQL с React, Node.js и Neo4j: практическое руководство. — М.: ДМК Пресс, 2023. — 264 с. — ISBN 978-5-93700-185-6.</w:t>
+        <w:t xml:space="preserve">13. Панфилов К. С. Создание веб-сайта от замысла до реализации / К. С. Панфилов. — М.: ДМК Пресс, 2023. — 438 с. — Текст: электронный. — URL: </w:t>
       </w:r>
+      <w:hyperlink r:id="rId10">
+        <w:r>
+          <w:rPr>
+            <w:rFonts w:ascii="Times New Roman" w:hAnsi="Times New Roman" w:cs="Times New Roman" w:eastAsia="Times New Roman"/>
+            <w:sz w:val="28"/>
+            <w:szCs w:val="28"/>
+            <w:color w:val="0563C1"/>
+            <w:u w:val="single"/>
+          </w:rPr>
+          <w:t xml:space="preserve">https://znanium.com/catalog/document?id=435452</w:t>
+        </w:r>
+      </w:hyperlink>
     </w:p>
     <w:p>
       <w:pPr>
@@ -310,8 +346,20 @@
           <w:color w:val="000000"/>
           <w:sz w:val="28"/>
         </w:rPr>
-        <w:t>13. Мартишин С. А. Базы данных. Практическое применение СУБД SQL и NoSQL-типа: учебное пособие. — М.: ДМК Пресс, 2023. — 454 с. — ISBN 978-5-8199-0946-1.</w:t>
+        <w:t xml:space="preserve">14. Сан Феликс М. Н. Разработка веб-приложений с Quarkus и React: практическое руководство / М. Н. Сан Феликс ; пер. с англ. А. Н. Киселева. — М.: ДМК Пресс, 2023. — 296 с. — ISBN 978-5-93700-207-5. — Текст: электронный. — URL: </w:t>
       </w:r>
+      <w:hyperlink r:id="rId17">
+        <w:r>
+          <w:rPr>
+            <w:rFonts w:ascii="Times New Roman" w:hAnsi="Times New Roman" w:cs="Times New Roman" w:eastAsia="Times New Roman"/>
+            <w:sz w:val="28"/>
+            <w:szCs w:val="28"/>
+            <w:color w:val="0563C1"/>
+            <w:u w:val="single"/>
+          </w:rPr>
+          <w:t xml:space="preserve">https://znanium.ru/catalog/document?id=462733</w:t>
+        </w:r>
+      </w:hyperlink>
     </w:p>
     <w:p>
       <w:pPr>
@@ -326,8 +374,20 @@
           <w:color w:val="000000"/>
           <w:sz w:val="28"/>
         </w:rPr>
-        <w:t>14. Мартишин С. А. Базы данных: работа с распределёнными базами данных и файловыми системами на примере MongoDB и HDFS с использованием Node.js, Express.js, Apache Spark и Scala. — М.: НИЦ ИНФРА-М, 2024. — 235 с. — ISBN 978-5-16-019912-2.</w:t>
+        <w:t xml:space="preserve">15. Сухов К. К. Node.js. Путеводитель по технологии: практическое руководство / К. К. Сухов. — 2-е изд. — М.: ДМК Пресс, 2023. — 417 с. — Текст: электронный. — URL: </w:t>
       </w:r>
+      <w:hyperlink r:id="rId18">
+        <w:r>
+          <w:rPr>
+            <w:rFonts w:ascii="Times New Roman" w:hAnsi="Times New Roman" w:cs="Times New Roman" w:eastAsia="Times New Roman"/>
+            <w:sz w:val="28"/>
+            <w:szCs w:val="28"/>
+            <w:color w:val="0563C1"/>
+            <w:u w:val="single"/>
+          </w:rPr>
+          <w:t xml:space="preserve">https://znanium.com/catalog/document?id=410023</w:t>
+        </w:r>
+      </w:hyperlink>
     </w:p>
     <w:p>
       <w:pPr>
@@ -342,8 +402,20 @@
           <w:color w:val="000000"/>
           <w:sz w:val="28"/>
         </w:rPr>
-        <w:t>15. Панфилов К. С. Создание веб-сайта от замысла до реализации: практическое руководство. — М.: ДМК Пресс, 2023. — 438 с. — ISBN 978-5-89818-476-6.</w:t>
+        <w:t xml:space="preserve">16. Фиайли К. SQL. Руководство по использованию с любыми СУБД / К. Фиайли. — М.: ДМК Пресс, 2023. — 454 с. — Текст: электронный. — URL: </w:t>
       </w:r>
+      <w:hyperlink r:id="rId19">
+        <w:r>
+          <w:rPr>
+            <w:rFonts w:ascii="Times New Roman" w:hAnsi="Times New Roman" w:cs="Times New Roman" w:eastAsia="Times New Roman"/>
+            <w:sz w:val="28"/>
+            <w:szCs w:val="28"/>
+            <w:color w:val="0563C1"/>
+            <w:u w:val="single"/>
+          </w:rPr>
+          <w:t xml:space="preserve">https://znanium.com/catalog/document?id=409456</w:t>
+        </w:r>
+      </w:hyperlink>
     </w:p>
     <w:p>
       <w:pPr>
@@ -358,8 +430,20 @@
           <w:color w:val="000000"/>
           <w:sz w:val="28"/>
         </w:rPr>
-        <w:t>16. Полуэктова Н. Р. Разработка веб-приложений: учебник для вузов. — 2-е изд. — М.: Юрайт, 2025. — 204 с. — ISBN 978-5-534-18645-1.</w:t>
+        <w:t xml:space="preserve">17. Флэнаган Д. JavaScript. Подробное руководство. 7-е изд. / Д. Флэнаган. — М.: Диалектика, 2021. — 720 с. — Текст: электронный. — URL: </w:t>
       </w:r>
+      <w:hyperlink r:id="rId20">
+        <w:r>
+          <w:rPr>
+            <w:rFonts w:ascii="Times New Roman" w:hAnsi="Times New Roman" w:cs="Times New Roman" w:eastAsia="Times New Roman"/>
+            <w:sz w:val="28"/>
+            <w:szCs w:val="28"/>
+            <w:color w:val="0563C1"/>
+            <w:u w:val="single"/>
+          </w:rPr>
+          <w:t xml:space="preserve">https://znanium.com/catalog/document?id=399447</w:t>
+        </w:r>
+      </w:hyperlink>
     </w:p>
     <w:p>
       <w:pPr>
@@ -374,8 +458,20 @@
           <w:color w:val="000000"/>
           <w:sz w:val="28"/>
         </w:rPr>
-        <w:t>17. Сухов К. К. Node.js. Путеводитель по технологии: практическое руководство. — 2-е изд. — М.: ДМК Пресс, 2023. — 417 с. — ISBN 978-5-89818-328-8.</w:t>
+        <w:t xml:space="preserve">18. Хорстманн К. С. Современный JavaScript для нетерпеливых / К. С. Хорстманн. — М.: ДМК Пресс, 2021. — 288 с. — Текст: электронный. — URL: </w:t>
       </w:r>
+      <w:hyperlink r:id="rId21">
+        <w:r>
+          <w:rPr>
+            <w:rFonts w:ascii="Times New Roman" w:hAnsi="Times New Roman" w:cs="Times New Roman" w:eastAsia="Times New Roman"/>
+            <w:sz w:val="28"/>
+            <w:szCs w:val="28"/>
+            <w:color w:val="0563C1"/>
+            <w:u w:val="single"/>
+          </w:rPr>
+          <w:t xml:space="preserve">https://znanium.com/catalog/document?id=409447</w:t>
+        </w:r>
+      </w:hyperlink>
     </w:p>
     <w:p>
       <w:pPr>
@@ -390,30 +486,20 @@
           <w:color w:val="000000"/>
           <w:sz w:val="28"/>
         </w:rPr>
-        <w:t xml:space="preserve">18. Тузовский А. Ф. Проектирование и разработка web-приложений: учебное пособие для среднего профессионального образования. — М.: Юрайт, 2024. — 219 с. — URL: </w:t>
+        <w:t xml:space="preserve">19. Хэррон Д. Node.js. Разработка серверных веб-приложений на JavaScript / Д. Хэррон. — М.: ДМК Пресс, 2023. — 145 с. — Текст: электронный. — URL: </w:t>
       </w:r>
-      <w:hyperlink r:id="rId13">
+      <w:hyperlink r:id="rId22">
         <w:r>
           <w:rPr>
-            <w:rStyle w:val="Hyperlink"/>
             <w:rFonts w:ascii="Times New Roman" w:hAnsi="Times New Roman" w:cs="Times New Roman" w:eastAsia="Times New Roman"/>
             <w:sz w:val="28"/>
             <w:szCs w:val="28"/>
             <w:color w:val="0563C1"/>
             <w:u w:val="single"/>
           </w:rPr>
-          <w:t xml:space="preserve">https://urait.ru/bcode/541917</w:t>
+          <w:t xml:space="preserve">https://znanium.com/catalog/document?id=409458</w:t>
         </w:r>
       </w:hyperlink>
-      <w:r>
-        <w:rPr>
-          <w:rFonts w:ascii="Times New Roman" w:hAnsi="Times New Roman" w:cs="Times New Roman" w:eastAsia="Times New Roman"/>
-          <w:b w:val="0"/>
-          <w:color w:val="000000"/>
-          <w:sz w:val="28"/>
-        </w:rPr>
-        <w:t>.</w:t>
-      </w:r>
     </w:p>
     <w:p>
       <w:pPr>
@@ -428,430 +514,20 @@
           <w:color w:val="000000"/>
           <w:sz w:val="28"/>
         </w:rPr>
-        <w:t>19. Фиайли К. SQL. Руководство для использования с любыми СУБД: учебное пособие. — М.: ДМК Пресс, 2023. — 454 с. — ISBN 978-5-89818-323-3.</w:t>
+        <w:t xml:space="preserve">20. Шитов В. Н. Разработка информационного контента (по отраслям): учебное пособие / В. Н. Шитов. — М.: НИЦ ИНФРА-М, 2022. — 178 с. — Текст: электронный. — URL: </w:t>
       </w:r>
-    </w:p>
-    <w:p>
-      <w:pPr>
-        <w:spacing w:line="360" w:lineRule="auto" w:after="0"/>
-        <w:ind w:firstLine="709"/>
-        <w:jc w:val="both"/>
-      </w:pPr>
-      <w:r>
-        <w:rPr>
-          <w:rFonts w:ascii="Times New Roman" w:hAnsi="Times New Roman" w:cs="Times New Roman" w:eastAsia="Times New Roman"/>
-          <w:b w:val="0"/>
-          <w:color w:val="000000"/>
-          <w:sz w:val="28"/>
-        </w:rPr>
-        <w:t>20. Флэнаган Д. JavaScript. Подробное руководство. 7-е изд. — М.: Диалектика (Вильямс), 2021. — 720 с.</w:t>
-      </w:r>
-    </w:p>
-    <w:p>
-      <w:pPr>
-        <w:spacing w:line="360" w:lineRule="auto" w:after="0"/>
-        <w:ind w:firstLine="709"/>
-        <w:jc w:val="both"/>
-      </w:pPr>
-      <w:r>
-        <w:rPr>
-          <w:rFonts w:ascii="Times New Roman" w:hAnsi="Times New Roman" w:cs="Times New Roman" w:eastAsia="Times New Roman"/>
-          <w:b w:val="0"/>
-          <w:color w:val="000000"/>
-          <w:sz w:val="28"/>
-        </w:rPr>
-        <w:t>21. Хорстманн К. С. Современный JavaScript для нетерпеливых: практическое руководство. — М.: ДМК Пресс, 2021. — 288 с. — ISBN 978-5-97060-177-8.</w:t>
-      </w:r>
-    </w:p>
-    <w:p>
-      <w:pPr>
-        <w:spacing w:line="360" w:lineRule="auto" w:after="0"/>
-        <w:ind w:firstLine="709"/>
-        <w:jc w:val="both"/>
-      </w:pPr>
-      <w:r>
-        <w:rPr>
-          <w:rFonts w:ascii="Times New Roman" w:hAnsi="Times New Roman" w:cs="Times New Roman" w:eastAsia="Times New Roman"/>
-          <w:b w:val="0"/>
-          <w:color w:val="000000"/>
-          <w:sz w:val="28"/>
-        </w:rPr>
-        <w:t>22. Хэррон Д. Node.js. Разработка серверных веб-приложений на JavaScript: практическое руководство. — М.: ДМК Пресс, 2023. — 145 с. — ISBN 978-5-89818-632-6.</w:t>
-      </w:r>
-    </w:p>
-    <w:p>
-      <w:pPr>
-        <w:spacing w:line="360" w:lineRule="auto" w:after="0"/>
-        <w:ind w:firstLine="709"/>
-        <w:jc w:val="both"/>
-      </w:pPr>
-      <w:r>
-        <w:rPr>
-          <w:rFonts w:ascii="Times New Roman" w:hAnsi="Times New Roman" w:cs="Times New Roman" w:eastAsia="Times New Roman"/>
-          <w:b w:val="0"/>
-          <w:color w:val="000000"/>
-          <w:sz w:val="28"/>
-        </w:rPr>
-        <w:t>23. Чернова Е. В. Информационная безопасность человека: учебник для вузов. — 3-е изд., перераб. и доп. — М.: Юрайт, 2025. — 327 с. — ISBN 978-5-534-16772-6.</w:t>
-      </w:r>
-    </w:p>
-    <w:p>
-      <w:pPr>
-        <w:spacing w:line="360" w:lineRule="auto" w:after="0"/>
-        <w:ind w:firstLine="709"/>
-        <w:jc w:val="both"/>
-      </w:pPr>
-      <w:r>
-        <w:rPr>
-          <w:rFonts w:ascii="Times New Roman" w:hAnsi="Times New Roman" w:cs="Times New Roman" w:eastAsia="Times New Roman"/>
-          <w:b w:val="0"/>
-          <w:color w:val="000000"/>
-          <w:sz w:val="28"/>
-        </w:rPr>
-        <w:t>24. Шитов В. Н. Разработка информационного контента (по отраслям): учебное пособие. — М.: НИЦ ИНФРА-М, 2022. — 178 с. — ISBN 978-5-16-017434-1.</w:t>
-      </w:r>
-    </w:p>
-    <w:p>
-      <w:pPr>
-        <w:spacing w:line="360" w:lineRule="auto" w:after="0"/>
-        <w:ind w:firstLine="709"/>
-        <w:jc w:val="both"/>
-      </w:pPr>
-      <w:r>
-        <w:rPr>
-          <w:rFonts w:ascii="Times New Roman" w:hAnsi="Times New Roman" w:cs="Times New Roman" w:eastAsia="Times New Roman"/>
-          <w:b w:val="0"/>
-          <w:color w:val="000000"/>
-          <w:sz w:val="28"/>
-        </w:rPr>
-        <w:t xml:space="preserve">25. Express.js: официальная документация. — Текст: электронный. — URL: </w:t>
-      </w:r>
-      <w:hyperlink r:id="rId14">
+      <w:hyperlink r:id="rId23">
         <w:r>
           <w:rPr>
-            <w:rStyle w:val="Hyperlink"/>
             <w:rFonts w:ascii="Times New Roman" w:hAnsi="Times New Roman" w:cs="Times New Roman" w:eastAsia="Times New Roman"/>
             <w:sz w:val="28"/>
             <w:szCs w:val="28"/>
             <w:color w:val="0563C1"/>
             <w:u w:val="single"/>
           </w:rPr>
-          <w:t xml:space="preserve">https://expressjs.com/</w:t>
+          <w:t xml:space="preserve">https://znanium.com/catalog/document?id=1858843</w:t>
         </w:r>
       </w:hyperlink>
-      <w:r>
-        <w:rPr>
-          <w:rFonts w:ascii="Times New Roman" w:hAnsi="Times New Roman" w:cs="Times New Roman" w:eastAsia="Times New Roman"/>
-          <w:b w:val="0"/>
-          <w:color w:val="000000"/>
-          <w:sz w:val="28"/>
-        </w:rPr>
-        <w:t>.</w:t>
-      </w:r>
-    </w:p>
-    <w:p>
-      <w:pPr>
-        <w:spacing w:line="360" w:lineRule="auto" w:after="0"/>
-        <w:ind w:firstLine="709"/>
-        <w:jc w:val="both"/>
-      </w:pPr>
-      <w:r>
-        <w:rPr>
-          <w:rFonts w:ascii="Times New Roman" w:hAnsi="Times New Roman" w:cs="Times New Roman" w:eastAsia="Times New Roman"/>
-          <w:b w:val="0"/>
-          <w:color w:val="000000"/>
-          <w:sz w:val="28"/>
-        </w:rPr>
-        <w:t xml:space="preserve">26. GitHub. Документация по Git и GitHub. — Текст: электронный. — URL: </w:t>
-      </w:r>
-      <w:hyperlink r:id="rId15">
-        <w:r>
-          <w:rPr>
-            <w:rStyle w:val="Hyperlink"/>
-            <w:rFonts w:ascii="Times New Roman" w:hAnsi="Times New Roman" w:cs="Times New Roman" w:eastAsia="Times New Roman"/>
-            <w:sz w:val="28"/>
-            <w:szCs w:val="28"/>
-            <w:color w:val="0563C1"/>
-            <w:u w:val="single"/>
-          </w:rPr>
-          <w:t xml:space="preserve">https://github.com/</w:t>
-        </w:r>
-      </w:hyperlink>
-      <w:r>
-        <w:rPr>
-          <w:rFonts w:ascii="Times New Roman" w:hAnsi="Times New Roman" w:cs="Times New Roman" w:eastAsia="Times New Roman"/>
-          <w:b w:val="0"/>
-          <w:color w:val="000000"/>
-          <w:sz w:val="28"/>
-        </w:rPr>
-        <w:t>.</w:t>
-      </w:r>
-    </w:p>
-    <w:p>
-      <w:pPr>
-        <w:spacing w:line="360" w:lineRule="auto" w:after="0"/>
-        <w:ind w:firstLine="709"/>
-        <w:jc w:val="both"/>
-      </w:pPr>
-      <w:r>
-        <w:rPr>
-          <w:rFonts w:ascii="Times New Roman" w:hAnsi="Times New Roman" w:cs="Times New Roman" w:eastAsia="Times New Roman"/>
-          <w:b w:val="0"/>
-          <w:color w:val="000000"/>
-          <w:sz w:val="28"/>
-        </w:rPr>
-        <w:t xml:space="preserve">27. GSAP (GreenSock Animation Platform): официальная документация. — Текст: электронный. — URL: </w:t>
-      </w:r>
-      <w:hyperlink r:id="rId16">
-        <w:r>
-          <w:rPr>
-            <w:rStyle w:val="Hyperlink"/>
-            <w:rFonts w:ascii="Times New Roman" w:hAnsi="Times New Roman" w:cs="Times New Roman" w:eastAsia="Times New Roman"/>
-            <w:sz w:val="28"/>
-            <w:szCs w:val="28"/>
-            <w:color w:val="0563C1"/>
-            <w:u w:val="single"/>
-          </w:rPr>
-          <w:t xml:space="preserve">https://gsap.com/docs/</w:t>
-        </w:r>
-      </w:hyperlink>
-      <w:r>
-        <w:rPr>
-          <w:rFonts w:ascii="Times New Roman" w:hAnsi="Times New Roman" w:cs="Times New Roman" w:eastAsia="Times New Roman"/>
-          <w:b w:val="0"/>
-          <w:color w:val="000000"/>
-          <w:sz w:val="28"/>
-        </w:rPr>
-        <w:t>.</w:t>
-      </w:r>
-    </w:p>
-    <w:p>
-      <w:pPr>
-        <w:spacing w:line="360" w:lineRule="auto" w:after="0"/>
-        <w:ind w:firstLine="709"/>
-        <w:jc w:val="both"/>
-      </w:pPr>
-      <w:r>
-        <w:rPr>
-          <w:rFonts w:ascii="Times New Roman" w:hAnsi="Times New Roman" w:cs="Times New Roman" w:eastAsia="Times New Roman"/>
-          <w:b w:val="0"/>
-          <w:color w:val="000000"/>
-          <w:sz w:val="28"/>
-        </w:rPr>
-        <w:t xml:space="preserve">28. MySQL: официальная документация. — Текст: электронный. — URL: </w:t>
-      </w:r>
-      <w:hyperlink r:id="rId17">
-        <w:r>
-          <w:rPr>
-            <w:rStyle w:val="Hyperlink"/>
-            <w:rFonts w:ascii="Times New Roman" w:hAnsi="Times New Roman" w:cs="Times New Roman" w:eastAsia="Times New Roman"/>
-            <w:sz w:val="28"/>
-            <w:szCs w:val="28"/>
-            <w:color w:val="0563C1"/>
-            <w:u w:val="single"/>
-          </w:rPr>
-          <w:t xml:space="preserve">https://dev.mysql.com/doc/</w:t>
-        </w:r>
-      </w:hyperlink>
-      <w:r>
-        <w:rPr>
-          <w:rFonts w:ascii="Times New Roman" w:hAnsi="Times New Roman" w:cs="Times New Roman" w:eastAsia="Times New Roman"/>
-          <w:b w:val="0"/>
-          <w:color w:val="000000"/>
-          <w:sz w:val="28"/>
-        </w:rPr>
-        <w:t>.</w:t>
-      </w:r>
-    </w:p>
-    <w:p>
-      <w:pPr>
-        <w:spacing w:line="360" w:lineRule="auto" w:after="0"/>
-        <w:ind w:firstLine="709"/>
-        <w:jc w:val="both"/>
-      </w:pPr>
-      <w:r>
-        <w:rPr>
-          <w:rFonts w:ascii="Times New Roman" w:hAnsi="Times New Roman" w:cs="Times New Roman" w:eastAsia="Times New Roman"/>
-          <w:b w:val="0"/>
-          <w:color w:val="000000"/>
-          <w:sz w:val="28"/>
-        </w:rPr>
-        <w:t xml:space="preserve">29. Node.js: официальная документация. — Текст: электронный. — URL: </w:t>
-      </w:r>
-      <w:hyperlink r:id="rId18">
-        <w:r>
-          <w:rPr>
-            <w:rStyle w:val="Hyperlink"/>
-            <w:rFonts w:ascii="Times New Roman" w:hAnsi="Times New Roman" w:cs="Times New Roman" w:eastAsia="Times New Roman"/>
-            <w:sz w:val="28"/>
-            <w:szCs w:val="28"/>
-            <w:color w:val="0563C1"/>
-            <w:u w:val="single"/>
-          </w:rPr>
-          <w:t xml:space="preserve">https://nodejs.org/docs/</w:t>
-        </w:r>
-      </w:hyperlink>
-      <w:r>
-        <w:rPr>
-          <w:rFonts w:ascii="Times New Roman" w:hAnsi="Times New Roman" w:cs="Times New Roman" w:eastAsia="Times New Roman"/>
-          <w:b w:val="0"/>
-          <w:color w:val="000000"/>
-          <w:sz w:val="28"/>
-        </w:rPr>
-        <w:t>.</w:t>
-      </w:r>
-    </w:p>
-    <w:p>
-      <w:pPr>
-        <w:spacing w:line="360" w:lineRule="auto" w:after="0"/>
-        <w:ind w:firstLine="709"/>
-        <w:jc w:val="both"/>
-      </w:pPr>
-      <w:r>
-        <w:rPr>
-          <w:rFonts w:ascii="Times New Roman" w:hAnsi="Times New Roman" w:cs="Times New Roman" w:eastAsia="Times New Roman"/>
-          <w:b w:val="0"/>
-          <w:color w:val="000000"/>
-          <w:sz w:val="28"/>
-        </w:rPr>
-        <w:t xml:space="preserve">30. OWASP Top 10: 2021. — Текст: электронный. — URL: </w:t>
-      </w:r>
-      <w:hyperlink r:id="rId19">
-        <w:r>
-          <w:rPr>
-            <w:rStyle w:val="Hyperlink"/>
-            <w:rFonts w:ascii="Times New Roman" w:hAnsi="Times New Roman" w:cs="Times New Roman" w:eastAsia="Times New Roman"/>
-            <w:sz w:val="28"/>
-            <w:szCs w:val="28"/>
-            <w:color w:val="0563C1"/>
-            <w:u w:val="single"/>
-          </w:rPr>
-          <w:t xml:space="preserve">https://owasp.org/Top10/</w:t>
-        </w:r>
-      </w:hyperlink>
-      <w:r>
-        <w:rPr>
-          <w:rFonts w:ascii="Times New Roman" w:hAnsi="Times New Roman" w:cs="Times New Roman" w:eastAsia="Times New Roman"/>
-          <w:b w:val="0"/>
-          <w:color w:val="000000"/>
-          <w:sz w:val="28"/>
-        </w:rPr>
-        <w:t>.</w:t>
-      </w:r>
-    </w:p>
-    <w:p>
-      <w:pPr>
-        <w:spacing w:line="360" w:lineRule="auto" w:after="0"/>
-        <w:ind w:firstLine="709"/>
-        <w:jc w:val="both"/>
-      </w:pPr>
-      <w:r>
-        <w:rPr>
-          <w:rFonts w:ascii="Times New Roman" w:hAnsi="Times New Roman" w:cs="Times New Roman" w:eastAsia="Times New Roman"/>
-          <w:b w:val="0"/>
-          <w:color w:val="000000"/>
-          <w:sz w:val="28"/>
-        </w:rPr>
-        <w:t xml:space="preserve">31. Three.js — JavaScript-библиотека для построения 3D-графики на основе WebGL: официальная документация. — Текст: электронный. — URL: </w:t>
-      </w:r>
-      <w:hyperlink r:id="rId20">
-        <w:r>
-          <w:rPr>
-            <w:rStyle w:val="Hyperlink"/>
-            <w:rFonts w:ascii="Times New Roman" w:hAnsi="Times New Roman" w:cs="Times New Roman" w:eastAsia="Times New Roman"/>
-            <w:sz w:val="28"/>
-            <w:szCs w:val="28"/>
-            <w:color w:val="0563C1"/>
-            <w:u w:val="single"/>
-          </w:rPr>
-          <w:t xml:space="preserve">https://threejs.org/docs/</w:t>
-        </w:r>
-      </w:hyperlink>
-      <w:r>
-        <w:rPr>
-          <w:rFonts w:ascii="Times New Roman" w:hAnsi="Times New Roman" w:cs="Times New Roman" w:eastAsia="Times New Roman"/>
-          <w:b w:val="0"/>
-          <w:color w:val="000000"/>
-          <w:sz w:val="28"/>
-        </w:rPr>
-        <w:t>.</w:t>
-      </w:r>
-    </w:p>
-    <w:p>
-      <w:pPr>
-        <w:spacing w:line="360" w:lineRule="auto" w:after="0"/>
-        <w:ind w:firstLine="709"/>
-        <w:jc w:val="both"/>
-      </w:pPr>
-      <w:r>
-        <w:rPr>
-          <w:rFonts w:ascii="Times New Roman" w:hAnsi="Times New Roman" w:cs="Times New Roman" w:eastAsia="Times New Roman"/>
-          <w:b w:val="0"/>
-          <w:color w:val="000000"/>
-          <w:sz w:val="28"/>
-        </w:rPr>
-        <w:t xml:space="preserve">32. W3C. World Wide Web Consortium: стандарты HTML и CSS. — Текст: электронный. — URL: </w:t>
-      </w:r>
-      <w:hyperlink r:id="rId21">
-        <w:r>
-          <w:rPr>
-            <w:rStyle w:val="Hyperlink"/>
-            <w:rFonts w:ascii="Times New Roman" w:hAnsi="Times New Roman" w:cs="Times New Roman" w:eastAsia="Times New Roman"/>
-            <w:sz w:val="28"/>
-            <w:szCs w:val="28"/>
-            <w:color w:val="0563C1"/>
-            <w:u w:val="single"/>
-          </w:rPr>
-          <w:t xml:space="preserve">https://www.w3.org/</w:t>
-        </w:r>
-      </w:hyperlink>
-      <w:r>
-        <w:rPr>
-          <w:rFonts w:ascii="Times New Roman" w:hAnsi="Times New Roman" w:cs="Times New Roman" w:eastAsia="Times New Roman"/>
-          <w:b w:val="0"/>
-          <w:color w:val="000000"/>
-          <w:sz w:val="28"/>
-        </w:rPr>
-        <w:t>.</w:t>
-      </w:r>
-    </w:p>
-    <w:p>
-      <w:pPr>
-        <w:spacing w:line="360" w:lineRule="auto" w:after="0"/>
-        <w:ind w:firstLine="709"/>
-        <w:jc w:val="both"/>
-      </w:pPr>
-      <w:r>
-        <w:rPr>
-          <w:rFonts w:ascii="Times New Roman" w:hAnsi="Times New Roman" w:cs="Times New Roman" w:eastAsia="Times New Roman"/>
-          <w:b w:val="0"/>
-          <w:color w:val="000000"/>
-          <w:sz w:val="28"/>
-        </w:rPr>
-        <w:t xml:space="preserve">33. Web Push Protocol (RFC 8030). — Текст: электронный. — URL: </w:t>
-      </w:r>
-      <w:hyperlink r:id="rId22">
-        <w:r>
-          <w:rPr>
-            <w:rStyle w:val="Hyperlink"/>
-            <w:rFonts w:ascii="Times New Roman" w:hAnsi="Times New Roman" w:cs="Times New Roman" w:eastAsia="Times New Roman"/>
-            <w:sz w:val="28"/>
-            <w:szCs w:val="28"/>
-            <w:color w:val="0563C1"/>
-            <w:u w:val="single"/>
-          </w:rPr>
-          <w:t xml:space="preserve">https://datatracker.ietf.org/doc/html/rfc8030</w:t>
-        </w:r>
-      </w:hyperlink>
-      <w:r>
-        <w:rPr>
-          <w:rFonts w:ascii="Times New Roman" w:hAnsi="Times New Roman" w:cs="Times New Roman" w:eastAsia="Times New Roman"/>
-          <w:b w:val="0"/>
-          <w:color w:val="000000"/>
-          <w:sz w:val="28"/>
-        </w:rPr>
-        <w:t>.</w:t>
-      </w:r>
     </w:p>
     <w:sectPr>
       <w:pgSz w:w="12240" w:h="15840"/>

</xml_diff>

<commit_message>
docs: remove hyperlink from Federal Law entry
https://claude.ai/code/session_01WBcR9y3fb3gMXiFrPhvoBr
</commit_message>
<xml_diff>
--- a/docs/reports/Список_источников_РЕМНАНТ.docx
+++ b/docs/reports/Список_источников_РЕМНАНТ.docx
@@ -30,20 +30,8 @@
           <w:color w:val="000000"/>
           <w:sz w:val="28"/>
         </w:rPr>
-        <w:t xml:space="preserve">1. Федеральный закон от 27.07.2006 № 149-ФЗ «Об информации, информационных технологиях и о защите информации». — Режим доступа: свободный. — URL: </w:t>
+        <w:t>1. Федеральный закон от 27.07.2006 № 149-ФЗ «Об информации, информационных технологиях и о защите информации».</w:t>
       </w:r>
-      <w:hyperlink r:id="rId9">
-        <w:r>
-          <w:rPr>
-            <w:rFonts w:ascii="Times New Roman" w:hAnsi="Times New Roman" w:cs="Times New Roman" w:eastAsia="Times New Roman"/>
-            <w:sz w:val="28"/>
-            <w:szCs w:val="28"/>
-            <w:color w:val="0563C1"/>
-            <w:u w:val="single"/>
-          </w:rPr>
-          <w:t xml:space="preserve">https://base.garant.ru/12148555/</w:t>
-        </w:r>
-      </w:hyperlink>
     </w:p>
     <w:p>
       <w:pPr>
@@ -124,7 +112,7 @@
         </w:rPr>
         <w:t xml:space="preserve">6. Бейтс М. CoffeeScript. Второе дыхание JavaScript: практическое руководство / М. Бейтс. — М.: ДМК Пресс, 2023. — 311 с. — Текст: электронный. — URL: </w:t>
       </w:r>
-      <w:hyperlink r:id="rId10">
+      <w:hyperlink r:id="rId9">
         <w:r>
           <w:rPr>
             <w:rFonts w:ascii="Times New Roman" w:hAnsi="Times New Roman" w:cs="Times New Roman" w:eastAsia="Times New Roman"/>
@@ -152,7 +140,7 @@
         </w:rPr>
         <w:t xml:space="preserve">7. Дакетт Д. JavaScript и jQuery. Интерактивная веб-разработка / Д. Дакетт. — М.: Эксмо, 2022. — 640 с. — Текст: электронный. — URL: </w:t>
       </w:r>
-      <w:hyperlink r:id="rId11">
+      <w:hyperlink r:id="rId10">
         <w:r>
           <w:rPr>
             <w:rFonts w:ascii="Times New Roman" w:hAnsi="Times New Roman" w:cs="Times New Roman" w:eastAsia="Times New Roman"/>
@@ -180,7 +168,7 @@
         </w:rPr>
         <w:t xml:space="preserve">8. Лион У. Разработка веб-приложений GraphQL с React, Node.js и Neo4j / У. Лион. — М.: ДМК Пресс, 2023. — 264 с. — Текст: электронный. — URL: </w:t>
       </w:r>
-      <w:hyperlink r:id="rId12">
+      <w:hyperlink r:id="rId11">
         <w:r>
           <w:rPr>
             <w:rFonts w:ascii="Times New Roman" w:hAnsi="Times New Roman" w:cs="Times New Roman" w:eastAsia="Times New Roman"/>
@@ -208,7 +196,7 @@
         </w:rPr>
         <w:t xml:space="preserve">9. Мартишин С. А. Базы данных. Практическое применение СУБД SQL и NoSQL-типа: учебное пособие / С. А. Мартишин. — М.: ДМК Пресс, 2023. — 454 с. — Текст: электронный. — URL: </w:t>
       </w:r>
-      <w:hyperlink r:id="rId13">
+      <w:hyperlink r:id="rId12">
         <w:r>
           <w:rPr>
             <w:rFonts w:ascii="Times New Roman" w:hAnsi="Times New Roman" w:cs="Times New Roman" w:eastAsia="Times New Roman"/>
@@ -236,7 +224,7 @@
         </w:rPr>
         <w:t xml:space="preserve">10. Мартишин С. А. Базы данных: работа с распределёнными базами данных и файловыми системами на примере MongoDB и HDFS / С. А. Мартишин. — М.: НИЦ ИНФРА-М, 2024. — 235 с. — Текст: электронный. — URL: </w:t>
       </w:r>
-      <w:hyperlink r:id="rId14">
+      <w:hyperlink r:id="rId13">
         <w:r>
           <w:rPr>
             <w:rFonts w:ascii="Times New Roman" w:hAnsi="Times New Roman" w:cs="Times New Roman" w:eastAsia="Times New Roman"/>
@@ -264,7 +252,7 @@
         </w:rPr>
         <w:t xml:space="preserve">11. Миковски М. Разработка одностраничных веб-приложений: практическое руководство / М. Миковски, Дж. К. Пауэлл ; пер. с англ. А. А. Слинкина. — 2-е изд. — М.: ДМК Пресс, 2023. — 514 с. — ISBN 978-5-89818-353-0. — Текст: электронный. — URL: </w:t>
       </w:r>
-      <w:hyperlink r:id="rId15">
+      <w:hyperlink r:id="rId14">
         <w:r>
           <w:rPr>
             <w:rFonts w:ascii="Times New Roman" w:hAnsi="Times New Roman" w:cs="Times New Roman" w:eastAsia="Times New Roman"/>
@@ -292,7 +280,7 @@
         </w:rPr>
         <w:t xml:space="preserve">12. Никсон Р. Создаём динамические веб-сайты с помощью PHP, MySQL, JavaScript, CSS и HTML5 / Р. Никсон. — СПб.: Питер, 2022. — 816 с. — Текст: электронный. — URL: </w:t>
       </w:r>
-      <w:hyperlink r:id="rId16">
+      <w:hyperlink r:id="rId15">
         <w:r>
           <w:rPr>
             <w:rFonts w:ascii="Times New Roman" w:hAnsi="Times New Roman" w:cs="Times New Roman" w:eastAsia="Times New Roman"/>
@@ -320,7 +308,7 @@
         </w:rPr>
         <w:t xml:space="preserve">13. Панфилов К. С. Создание веб-сайта от замысла до реализации / К. С. Панфилов. — М.: ДМК Пресс, 2023. — 438 с. — Текст: электронный. — URL: </w:t>
       </w:r>
-      <w:hyperlink r:id="rId10">
+      <w:hyperlink r:id="rId9">
         <w:r>
           <w:rPr>
             <w:rFonts w:ascii="Times New Roman" w:hAnsi="Times New Roman" w:cs="Times New Roman" w:eastAsia="Times New Roman"/>
@@ -348,7 +336,7 @@
         </w:rPr>
         <w:t xml:space="preserve">14. Сан Феликс М. Н. Разработка веб-приложений с Quarkus и React: практическое руководство / М. Н. Сан Феликс ; пер. с англ. А. Н. Киселева. — М.: ДМК Пресс, 2023. — 296 с. — ISBN 978-5-93700-207-5. — Текст: электронный. — URL: </w:t>
       </w:r>
-      <w:hyperlink r:id="rId17">
+      <w:hyperlink r:id="rId16">
         <w:r>
           <w:rPr>
             <w:rFonts w:ascii="Times New Roman" w:hAnsi="Times New Roman" w:cs="Times New Roman" w:eastAsia="Times New Roman"/>
@@ -376,7 +364,7 @@
         </w:rPr>
         <w:t xml:space="preserve">15. Сухов К. К. Node.js. Путеводитель по технологии: практическое руководство / К. К. Сухов. — 2-е изд. — М.: ДМК Пресс, 2023. — 417 с. — Текст: электронный. — URL: </w:t>
       </w:r>
-      <w:hyperlink r:id="rId18">
+      <w:hyperlink r:id="rId17">
         <w:r>
           <w:rPr>
             <w:rFonts w:ascii="Times New Roman" w:hAnsi="Times New Roman" w:cs="Times New Roman" w:eastAsia="Times New Roman"/>
@@ -404,7 +392,7 @@
         </w:rPr>
         <w:t xml:space="preserve">16. Фиайли К. SQL. Руководство по использованию с любыми СУБД / К. Фиайли. — М.: ДМК Пресс, 2023. — 454 с. — Текст: электронный. — URL: </w:t>
       </w:r>
-      <w:hyperlink r:id="rId19">
+      <w:hyperlink r:id="rId18">
         <w:r>
           <w:rPr>
             <w:rFonts w:ascii="Times New Roman" w:hAnsi="Times New Roman" w:cs="Times New Roman" w:eastAsia="Times New Roman"/>
@@ -432,7 +420,7 @@
         </w:rPr>
         <w:t xml:space="preserve">17. Флэнаган Д. JavaScript. Подробное руководство. 7-е изд. / Д. Флэнаган. — М.: Диалектика, 2021. — 720 с. — Текст: электронный. — URL: </w:t>
       </w:r>
-      <w:hyperlink r:id="rId20">
+      <w:hyperlink r:id="rId19">
         <w:r>
           <w:rPr>
             <w:rFonts w:ascii="Times New Roman" w:hAnsi="Times New Roman" w:cs="Times New Roman" w:eastAsia="Times New Roman"/>
@@ -460,7 +448,7 @@
         </w:rPr>
         <w:t xml:space="preserve">18. Хорстманн К. С. Современный JavaScript для нетерпеливых / К. С. Хорстманн. — М.: ДМК Пресс, 2021. — 288 с. — Текст: электронный. — URL: </w:t>
       </w:r>
-      <w:hyperlink r:id="rId21">
+      <w:hyperlink r:id="rId20">
         <w:r>
           <w:rPr>
             <w:rFonts w:ascii="Times New Roman" w:hAnsi="Times New Roman" w:cs="Times New Roman" w:eastAsia="Times New Roman"/>
@@ -488,7 +476,7 @@
         </w:rPr>
         <w:t xml:space="preserve">19. Хэррон Д. Node.js. Разработка серверных веб-приложений на JavaScript / Д. Хэррон. — М.: ДМК Пресс, 2023. — 145 с. — Текст: электронный. — URL: </w:t>
       </w:r>
-      <w:hyperlink r:id="rId22">
+      <w:hyperlink r:id="rId21">
         <w:r>
           <w:rPr>
             <w:rFonts w:ascii="Times New Roman" w:hAnsi="Times New Roman" w:cs="Times New Roman" w:eastAsia="Times New Roman"/>
@@ -516,7 +504,7 @@
         </w:rPr>
         <w:t xml:space="preserve">20. Шитов В. Н. Разработка информационного контента (по отраслям): учебное пособие / В. Н. Шитов. — М.: НИЦ ИНФРА-М, 2022. — 178 с. — Текст: электронный. — URL: </w:t>
       </w:r>
-      <w:hyperlink r:id="rId23">
+      <w:hyperlink r:id="rId22">
         <w:r>
           <w:rPr>
             <w:rFonts w:ascii="Times New Roman" w:hAnsi="Times New Roman" w:cs="Times New Roman" w:eastAsia="Times New Roman"/>

</xml_diff>

<commit_message>
docs: remove ФЗ entry, renumber starting from ГОСТ as №1
https://claude.ai/code/session_01WBcR9y3fb3gMXiFrPhvoBr
</commit_message>
<xml_diff>
--- a/docs/reports/Список_источников_РЕМНАНТ.docx
+++ b/docs/reports/Список_источников_РЕМНАНТ.docx
@@ -30,7 +30,7 @@
           <w:color w:val="000000"/>
           <w:sz w:val="28"/>
         </w:rPr>
-        <w:t>1. Федеральный закон от 27.07.2006 № 149-ФЗ «Об информации, информационных технологиях и о защите информации».</w:t>
+        <w:t>1. ГОСТ 19.101-77. Единая система программной документации (ЕСПД). Общие положения. — М.: Изд-во стандартов, 2006.</w:t>
       </w:r>
     </w:p>
     <w:p>
@@ -46,7 +46,7 @@
           <w:color w:val="000000"/>
           <w:sz w:val="28"/>
         </w:rPr>
-        <w:t>2. ГОСТ 19.101-77. Единая система программной документации (ЕСПД). Общие положения. — М.: Изд-во стандартов, 2006.</w:t>
+        <w:t>2. ГОСТ 34.601-90. Информационная технология. Автоматизированные системы. Стадии создания.</w:t>
       </w:r>
     </w:p>
     <w:p>
@@ -62,7 +62,7 @@
           <w:color w:val="000000"/>
           <w:sz w:val="28"/>
         </w:rPr>
-        <w:t>3. ГОСТ 34.601-90. Информационная технология. Автоматизированные системы. Стадии создания.</w:t>
+        <w:t>3. ГОСТ 34.602-89. Информационная технология. Техническое задание на создание автоматизированной системы.</w:t>
       </w:r>
     </w:p>
     <w:p>
@@ -78,7 +78,7 @@
           <w:color w:val="000000"/>
           <w:sz w:val="28"/>
         </w:rPr>
-        <w:t>4. ГОСТ 34.602-89. Информационная технология. Техническое задание на создание автоматизированной системы.</w:t>
+        <w:t>4. ГОСТ Р 7.0.8-2013. Национальный стандарт Российской Федерации. Системы обработки информации. Основные положения.</w:t>
       </w:r>
     </w:p>
     <w:p>
@@ -94,23 +94,7 @@
           <w:color w:val="000000"/>
           <w:sz w:val="28"/>
         </w:rPr>
-        <w:t>5. ГОСТ Р 7.0.8-2013. Национальный стандарт Российской Федерации. Системы обработки информации. Основные положения.</w:t>
-      </w:r>
-    </w:p>
-    <w:p>
-      <w:pPr>
-        <w:spacing w:line="360" w:lineRule="auto" w:after="0"/>
-        <w:ind w:firstLine="709"/>
-        <w:jc w:val="both"/>
-      </w:pPr>
-      <w:r>
-        <w:rPr>
-          <w:rFonts w:ascii="Times New Roman" w:hAnsi="Times New Roman" w:cs="Times New Roman" w:eastAsia="Times New Roman"/>
-          <w:b w:val="0"/>
-          <w:color w:val="000000"/>
-          <w:sz w:val="28"/>
-        </w:rPr>
-        <w:t xml:space="preserve">6. Бейтс М. CoffeeScript. Второе дыхание JavaScript: практическое руководство / М. Бейтс. — М.: ДМК Пресс, 2023. — 311 с. — Текст: электронный. — URL: </w:t>
+        <w:t xml:space="preserve">5. Бейтс М. CoffeeScript. Второе дыхание JavaScript: практическое руководство / М. Бейтс. — М.: ДМК Пресс, 2023. — 311 с. — Текст: электронный. — URL: </w:t>
       </w:r>
       <w:hyperlink r:id="rId9">
         <w:r>
@@ -138,7 +122,7 @@
           <w:color w:val="000000"/>
           <w:sz w:val="28"/>
         </w:rPr>
-        <w:t xml:space="preserve">7. Дакетт Д. JavaScript и jQuery. Интерактивная веб-разработка / Д. Дакетт. — М.: Эксмо, 2022. — 640 с. — Текст: электронный. — URL: </w:t>
+        <w:t xml:space="preserve">6. Дакетт Д. JavaScript и jQuery. Интерактивная веб-разработка / Д. Дакетт. — М.: Эксмо, 2022. — 640 с. — Текст: электронный. — URL: </w:t>
       </w:r>
       <w:hyperlink r:id="rId10">
         <w:r>
@@ -166,7 +150,7 @@
           <w:color w:val="000000"/>
           <w:sz w:val="28"/>
         </w:rPr>
-        <w:t xml:space="preserve">8. Лион У. Разработка веб-приложений GraphQL с React, Node.js и Neo4j / У. Лион. — М.: ДМК Пресс, 2023. — 264 с. — Текст: электронный. — URL: </w:t>
+        <w:t xml:space="preserve">7. Лион У. Разработка веб-приложений GraphQL с React, Node.js и Neo4j / У. Лион. — М.: ДМК Пресс, 2023. — 264 с. — Текст: электронный. — URL: </w:t>
       </w:r>
       <w:hyperlink r:id="rId11">
         <w:r>
@@ -194,7 +178,7 @@
           <w:color w:val="000000"/>
           <w:sz w:val="28"/>
         </w:rPr>
-        <w:t xml:space="preserve">9. Мартишин С. А. Базы данных. Практическое применение СУБД SQL и NoSQL-типа: учебное пособие / С. А. Мартишин. — М.: ДМК Пресс, 2023. — 454 с. — Текст: электронный. — URL: </w:t>
+        <w:t xml:space="preserve">8. Мартишин С. А. Базы данных. Практическое применение СУБД SQL и NoSQL-типа: учебное пособие / С. А. Мартишин. — М.: ДМК Пресс, 2023. — 454 с. — Текст: электронный. — URL: </w:t>
       </w:r>
       <w:hyperlink r:id="rId12">
         <w:r>
@@ -222,7 +206,7 @@
           <w:color w:val="000000"/>
           <w:sz w:val="28"/>
         </w:rPr>
-        <w:t xml:space="preserve">10. Мартишин С. А. Базы данных: работа с распределёнными базами данных и файловыми системами на примере MongoDB и HDFS / С. А. Мартишин. — М.: НИЦ ИНФРА-М, 2024. — 235 с. — Текст: электронный. — URL: </w:t>
+        <w:t xml:space="preserve">9. Мартишин С. А. Базы данных: работа с распределёнными базами данных и файловыми системами на примере MongoDB и HDFS / С. А. Мартишин. — М.: НИЦ ИНФРА-М, 2024. — 235 с. — Текст: электронный. — URL: </w:t>
       </w:r>
       <w:hyperlink r:id="rId13">
         <w:r>
@@ -250,7 +234,7 @@
           <w:color w:val="000000"/>
           <w:sz w:val="28"/>
         </w:rPr>
-        <w:t xml:space="preserve">11. Миковски М. Разработка одностраничных веб-приложений: практическое руководство / М. Миковски, Дж. К. Пауэлл ; пер. с англ. А. А. Слинкина. — 2-е изд. — М.: ДМК Пресс, 2023. — 514 с. — ISBN 978-5-89818-353-0. — Текст: электронный. — URL: </w:t>
+        <w:t xml:space="preserve">10. Миковски М. Разработка одностраничных веб-приложений: практическое руководство / М. Миковски, Дж. К. Пауэлл ; пер. с англ. А. А. Слинкина. — 2-е изд. — М.: ДМК Пресс, 2023. — 514 с. — ISBN 978-5-89818-353-0. — Текст: электронный. — URL: </w:t>
       </w:r>
       <w:hyperlink r:id="rId14">
         <w:r>
@@ -278,7 +262,7 @@
           <w:color w:val="000000"/>
           <w:sz w:val="28"/>
         </w:rPr>
-        <w:t xml:space="preserve">12. Никсон Р. Создаём динамические веб-сайты с помощью PHP, MySQL, JavaScript, CSS и HTML5 / Р. Никсон. — СПб.: Питер, 2022. — 816 с. — Текст: электронный. — URL: </w:t>
+        <w:t xml:space="preserve">11. Никсон Р. Создаём динамические веб-сайты с помощью PHP, MySQL, JavaScript, CSS и HTML5 / Р. Никсон. — СПб.: Питер, 2022. — 816 с. — Текст: электронный. — URL: </w:t>
       </w:r>
       <w:hyperlink r:id="rId15">
         <w:r>
@@ -306,7 +290,7 @@
           <w:color w:val="000000"/>
           <w:sz w:val="28"/>
         </w:rPr>
-        <w:t xml:space="preserve">13. Панфилов К. С. Создание веб-сайта от замысла до реализации / К. С. Панфилов. — М.: ДМК Пресс, 2023. — 438 с. — Текст: электронный. — URL: </w:t>
+        <w:t xml:space="preserve">12. Панфилов К. С. Создание веб-сайта от замысла до реализации / К. С. Панфилов. — М.: ДМК Пресс, 2023. — 438 с. — Текст: электронный. — URL: </w:t>
       </w:r>
       <w:hyperlink r:id="rId9">
         <w:r>
@@ -334,7 +318,7 @@
           <w:color w:val="000000"/>
           <w:sz w:val="28"/>
         </w:rPr>
-        <w:t xml:space="preserve">14. Сан Феликс М. Н. Разработка веб-приложений с Quarkus и React: практическое руководство / М. Н. Сан Феликс ; пер. с англ. А. Н. Киселева. — М.: ДМК Пресс, 2023. — 296 с. — ISBN 978-5-93700-207-5. — Текст: электронный. — URL: </w:t>
+        <w:t xml:space="preserve">13. Сан Феликс М. Н. Разработка веб-приложений с Quarkus и React: практическое руководство / М. Н. Сан Феликс ; пер. с англ. А. Н. Киселева. — М.: ДМК Пресс, 2023. — 296 с. — ISBN 978-5-93700-207-5. — Текст: электронный. — URL: </w:t>
       </w:r>
       <w:hyperlink r:id="rId16">
         <w:r>
@@ -362,7 +346,7 @@
           <w:color w:val="000000"/>
           <w:sz w:val="28"/>
         </w:rPr>
-        <w:t xml:space="preserve">15. Сухов К. К. Node.js. Путеводитель по технологии: практическое руководство / К. К. Сухов. — 2-е изд. — М.: ДМК Пресс, 2023. — 417 с. — Текст: электронный. — URL: </w:t>
+        <w:t xml:space="preserve">14. Сухов К. К. Node.js. Путеводитель по технологии: практическое руководство / К. К. Сухов. — 2-е изд. — М.: ДМК Пресс, 2023. — 417 с. — Текст: электронный. — URL: </w:t>
       </w:r>
       <w:hyperlink r:id="rId17">
         <w:r>
@@ -390,7 +374,7 @@
           <w:color w:val="000000"/>
           <w:sz w:val="28"/>
         </w:rPr>
-        <w:t xml:space="preserve">16. Фиайли К. SQL. Руководство по использованию с любыми СУБД / К. Фиайли. — М.: ДМК Пресс, 2023. — 454 с. — Текст: электронный. — URL: </w:t>
+        <w:t xml:space="preserve">15. Фиайли К. SQL. Руководство по использованию с любыми СУБД / К. Фиайли. — М.: ДМК Пресс, 2023. — 454 с. — Текст: электронный. — URL: </w:t>
       </w:r>
       <w:hyperlink r:id="rId18">
         <w:r>
@@ -418,7 +402,7 @@
           <w:color w:val="000000"/>
           <w:sz w:val="28"/>
         </w:rPr>
-        <w:t xml:space="preserve">17. Флэнаган Д. JavaScript. Подробное руководство. 7-е изд. / Д. Флэнаган. — М.: Диалектика, 2021. — 720 с. — Текст: электронный. — URL: </w:t>
+        <w:t xml:space="preserve">16. Флэнаган Д. JavaScript. Подробное руководство. 7-е изд. / Д. Флэнаган. — М.: Диалектика, 2021. — 720 с. — Текст: электронный. — URL: </w:t>
       </w:r>
       <w:hyperlink r:id="rId19">
         <w:r>
@@ -446,7 +430,7 @@
           <w:color w:val="000000"/>
           <w:sz w:val="28"/>
         </w:rPr>
-        <w:t xml:space="preserve">18. Хорстманн К. С. Современный JavaScript для нетерпеливых / К. С. Хорстманн. — М.: ДМК Пресс, 2021. — 288 с. — Текст: электронный. — URL: </w:t>
+        <w:t xml:space="preserve">17. Хорстманн К. С. Современный JavaScript для нетерпеливых / К. С. Хорстманн. — М.: ДМК Пресс, 2021. — 288 с. — Текст: электронный. — URL: </w:t>
       </w:r>
       <w:hyperlink r:id="rId20">
         <w:r>
@@ -474,7 +458,7 @@
           <w:color w:val="000000"/>
           <w:sz w:val="28"/>
         </w:rPr>
-        <w:t xml:space="preserve">19. Хэррон Д. Node.js. Разработка серверных веб-приложений на JavaScript / Д. Хэррон. — М.: ДМК Пресс, 2023. — 145 с. — Текст: электронный. — URL: </w:t>
+        <w:t xml:space="preserve">18. Хэррон Д. Node.js. Разработка серверных веб-приложений на JavaScript / Д. Хэррон. — М.: ДМК Пресс, 2023. — 145 с. — Текст: электронный. — URL: </w:t>
       </w:r>
       <w:hyperlink r:id="rId21">
         <w:r>
@@ -502,7 +486,7 @@
           <w:color w:val="000000"/>
           <w:sz w:val="28"/>
         </w:rPr>
-        <w:t xml:space="preserve">20. Шитов В. Н. Разработка информационного контента (по отраслям): учебное пособие / В. Н. Шитов. — М.: НИЦ ИНФРА-М, 2022. — 178 с. — Текст: электронный. — URL: </w:t>
+        <w:t xml:space="preserve">19. Шитов В. Н. Разработка информационного контента (по отраслям): учебное пособие / В. Н. Шитов. — М.: НИЦ ИНФРА-М, 2022. — 178 с. — Текст: электронный. — URL: </w:t>
       </w:r>
       <w:hyperlink r:id="rId22">
         <w:r>

</xml_diff>

<commit_message>
docs: add 20th source, use semicolon separators with final period
https://claude.ai/code/session_01WBcR9y3fb3gMXiFrPhvoBr
</commit_message>
<xml_diff>
--- a/docs/reports/Список_источников_РЕМНАНТ.docx
+++ b/docs/reports/Список_источников_РЕМНАНТ.docx
@@ -30,7 +30,7 @@
           <w:color w:val="000000"/>
           <w:sz w:val="28"/>
         </w:rPr>
-        <w:t>1. ГОСТ 19.101-77. Единая система программной документации (ЕСПД). Общие положения. — М.: Изд-во стандартов, 2006.</w:t>
+        <w:t>1. ГОСТ 19.101-77. Единая система программной документации (ЕСПД). Общие положения. — М.: Изд-во стандартов, 2006;</w:t>
       </w:r>
     </w:p>
     <w:p>
@@ -46,7 +46,7 @@
           <w:color w:val="000000"/>
           <w:sz w:val="28"/>
         </w:rPr>
-        <w:t>2. ГОСТ 34.601-90. Информационная технология. Автоматизированные системы. Стадии создания.</w:t>
+        <w:t>2. ГОСТ 34.601-90. Информационная технология. Автоматизированные системы. Стадии создания;</w:t>
       </w:r>
     </w:p>
     <w:p>
@@ -62,7 +62,7 @@
           <w:color w:val="000000"/>
           <w:sz w:val="28"/>
         </w:rPr>
-        <w:t>3. ГОСТ 34.602-89. Информационная технология. Техническое задание на создание автоматизированной системы.</w:t>
+        <w:t>3. ГОСТ 34.602-89. Информационная технология. Техническое задание на создание автоматизированной системы;</w:t>
       </w:r>
     </w:p>
     <w:p>
@@ -78,7 +78,7 @@
           <w:color w:val="000000"/>
           <w:sz w:val="28"/>
         </w:rPr>
-        <w:t>4. ГОСТ Р 7.0.8-2013. Национальный стандарт Российской Федерации. Системы обработки информации. Основные положения.</w:t>
+        <w:t>4. ГОСТ Р 7.0.8-2013. Национальный стандарт Российской Федерации. Системы обработки информации. Основные положения;</w:t>
       </w:r>
     </w:p>
     <w:p>
@@ -108,6 +108,15 @@
           <w:t xml:space="preserve">https://znanium.com/catalog/document?id=435452</w:t>
         </w:r>
       </w:hyperlink>
+      <w:r>
+        <w:rPr>
+          <w:rFonts w:ascii="Times New Roman" w:hAnsi="Times New Roman" w:cs="Times New Roman" w:eastAsia="Times New Roman"/>
+          <w:b w:val="0"/>
+          <w:color w:val="000000"/>
+          <w:sz w:val="28"/>
+        </w:rPr>
+        <w:t>;</w:t>
+      </w:r>
     </w:p>
     <w:p>
       <w:pPr>
@@ -136,6 +145,15 @@
           <w:t xml:space="preserve">https://znanium.com/catalog/document?id=423558</w:t>
         </w:r>
       </w:hyperlink>
+      <w:r>
+        <w:rPr>
+          <w:rFonts w:ascii="Times New Roman" w:hAnsi="Times New Roman" w:cs="Times New Roman" w:eastAsia="Times New Roman"/>
+          <w:b w:val="0"/>
+          <w:color w:val="000000"/>
+          <w:sz w:val="28"/>
+        </w:rPr>
+        <w:t>;</w:t>
+      </w:r>
     </w:p>
     <w:p>
       <w:pPr>
@@ -164,6 +182,15 @@
           <w:t xml:space="preserve">https://znanium.com/catalog/document?id=429181</w:t>
         </w:r>
       </w:hyperlink>
+      <w:r>
+        <w:rPr>
+          <w:rFonts w:ascii="Times New Roman" w:hAnsi="Times New Roman" w:cs="Times New Roman" w:eastAsia="Times New Roman"/>
+          <w:b w:val="0"/>
+          <w:color w:val="000000"/>
+          <w:sz w:val="28"/>
+        </w:rPr>
+        <w:t>;</w:t>
+      </w:r>
     </w:p>
     <w:p>
       <w:pPr>
@@ -192,6 +219,15 @@
           <w:t xml:space="preserve">https://znanium.com/catalog/document?id=415803</w:t>
         </w:r>
       </w:hyperlink>
+      <w:r>
+        <w:rPr>
+          <w:rFonts w:ascii="Times New Roman" w:hAnsi="Times New Roman" w:cs="Times New Roman" w:eastAsia="Times New Roman"/>
+          <w:b w:val="0"/>
+          <w:color w:val="000000"/>
+          <w:sz w:val="28"/>
+        </w:rPr>
+        <w:t>;</w:t>
+      </w:r>
     </w:p>
     <w:p>
       <w:pPr>
@@ -220,6 +256,15 @@
           <w:t xml:space="preserve">https://znanium.com/catalog/document?id=2120091</w:t>
         </w:r>
       </w:hyperlink>
+      <w:r>
+        <w:rPr>
+          <w:rFonts w:ascii="Times New Roman" w:hAnsi="Times New Roman" w:cs="Times New Roman" w:eastAsia="Times New Roman"/>
+          <w:b w:val="0"/>
+          <w:color w:val="000000"/>
+          <w:sz w:val="28"/>
+        </w:rPr>
+        <w:t>;</w:t>
+      </w:r>
     </w:p>
     <w:p>
       <w:pPr>
@@ -248,6 +293,15 @@
           <w:t xml:space="preserve">https://znanium.ru/catalog/document?id=435034</w:t>
         </w:r>
       </w:hyperlink>
+      <w:r>
+        <w:rPr>
+          <w:rFonts w:ascii="Times New Roman" w:hAnsi="Times New Roman" w:cs="Times New Roman" w:eastAsia="Times New Roman"/>
+          <w:b w:val="0"/>
+          <w:color w:val="000000"/>
+          <w:sz w:val="28"/>
+        </w:rPr>
+        <w:t>;</w:t>
+      </w:r>
     </w:p>
     <w:p>
       <w:pPr>
@@ -276,6 +330,15 @@
           <w:t xml:space="preserve">https://znanium.com/catalog/document?id=427801</w:t>
         </w:r>
       </w:hyperlink>
+      <w:r>
+        <w:rPr>
+          <w:rFonts w:ascii="Times New Roman" w:hAnsi="Times New Roman" w:cs="Times New Roman" w:eastAsia="Times New Roman"/>
+          <w:b w:val="0"/>
+          <w:color w:val="000000"/>
+          <w:sz w:val="28"/>
+        </w:rPr>
+        <w:t>;</w:t>
+      </w:r>
     </w:p>
     <w:p>
       <w:pPr>
@@ -304,6 +367,15 @@
           <w:t xml:space="preserve">https://znanium.com/catalog/document?id=435452</w:t>
         </w:r>
       </w:hyperlink>
+      <w:r>
+        <w:rPr>
+          <w:rFonts w:ascii="Times New Roman" w:hAnsi="Times New Roman" w:cs="Times New Roman" w:eastAsia="Times New Roman"/>
+          <w:b w:val="0"/>
+          <w:color w:val="000000"/>
+          <w:sz w:val="28"/>
+        </w:rPr>
+        <w:t>;</w:t>
+      </w:r>
     </w:p>
     <w:p>
       <w:pPr>
@@ -332,6 +404,15 @@
           <w:t xml:space="preserve">https://znanium.ru/catalog/document?id=462733</w:t>
         </w:r>
       </w:hyperlink>
+      <w:r>
+        <w:rPr>
+          <w:rFonts w:ascii="Times New Roman" w:hAnsi="Times New Roman" w:cs="Times New Roman" w:eastAsia="Times New Roman"/>
+          <w:b w:val="0"/>
+          <w:color w:val="000000"/>
+          <w:sz w:val="28"/>
+        </w:rPr>
+        <w:t>;</w:t>
+      </w:r>
     </w:p>
     <w:p>
       <w:pPr>
@@ -360,6 +441,15 @@
           <w:t xml:space="preserve">https://znanium.com/catalog/document?id=410023</w:t>
         </w:r>
       </w:hyperlink>
+      <w:r>
+        <w:rPr>
+          <w:rFonts w:ascii="Times New Roman" w:hAnsi="Times New Roman" w:cs="Times New Roman" w:eastAsia="Times New Roman"/>
+          <w:b w:val="0"/>
+          <w:color w:val="000000"/>
+          <w:sz w:val="28"/>
+        </w:rPr>
+        <w:t>;</w:t>
+      </w:r>
     </w:p>
     <w:p>
       <w:pPr>
@@ -388,6 +478,15 @@
           <w:t xml:space="preserve">https://znanium.com/catalog/document?id=409456</w:t>
         </w:r>
       </w:hyperlink>
+      <w:r>
+        <w:rPr>
+          <w:rFonts w:ascii="Times New Roman" w:hAnsi="Times New Roman" w:cs="Times New Roman" w:eastAsia="Times New Roman"/>
+          <w:b w:val="0"/>
+          <w:color w:val="000000"/>
+          <w:sz w:val="28"/>
+        </w:rPr>
+        <w:t>;</w:t>
+      </w:r>
     </w:p>
     <w:p>
       <w:pPr>
@@ -416,6 +515,15 @@
           <w:t xml:space="preserve">https://znanium.com/catalog/document?id=399447</w:t>
         </w:r>
       </w:hyperlink>
+      <w:r>
+        <w:rPr>
+          <w:rFonts w:ascii="Times New Roman" w:hAnsi="Times New Roman" w:cs="Times New Roman" w:eastAsia="Times New Roman"/>
+          <w:b w:val="0"/>
+          <w:color w:val="000000"/>
+          <w:sz w:val="28"/>
+        </w:rPr>
+        <w:t>;</w:t>
+      </w:r>
     </w:p>
     <w:p>
       <w:pPr>
@@ -444,6 +552,15 @@
           <w:t xml:space="preserve">https://znanium.com/catalog/document?id=409447</w:t>
         </w:r>
       </w:hyperlink>
+      <w:r>
+        <w:rPr>
+          <w:rFonts w:ascii="Times New Roman" w:hAnsi="Times New Roman" w:cs="Times New Roman" w:eastAsia="Times New Roman"/>
+          <w:b w:val="0"/>
+          <w:color w:val="000000"/>
+          <w:sz w:val="28"/>
+        </w:rPr>
+        <w:t>;</w:t>
+      </w:r>
     </w:p>
     <w:p>
       <w:pPr>
@@ -472,6 +589,15 @@
           <w:t xml:space="preserve">https://znanium.com/catalog/document?id=409458</w:t>
         </w:r>
       </w:hyperlink>
+      <w:r>
+        <w:rPr>
+          <w:rFonts w:ascii="Times New Roman" w:hAnsi="Times New Roman" w:cs="Times New Roman" w:eastAsia="Times New Roman"/>
+          <w:b w:val="0"/>
+          <w:color w:val="000000"/>
+          <w:sz w:val="28"/>
+        </w:rPr>
+        <w:t>;</w:t>
+      </w:r>
     </w:p>
     <w:p>
       <w:pPr>
@@ -500,6 +626,52 @@
           <w:t xml:space="preserve">https://znanium.com/catalog/document?id=1858843</w:t>
         </w:r>
       </w:hyperlink>
+      <w:r>
+        <w:rPr>
+          <w:rFonts w:ascii="Times New Roman" w:hAnsi="Times New Roman" w:cs="Times New Roman" w:eastAsia="Times New Roman"/>
+          <w:b w:val="0"/>
+          <w:color w:val="000000"/>
+          <w:sz w:val="28"/>
+        </w:rPr>
+        <w:t>;</w:t>
+      </w:r>
+    </w:p>
+    <w:p>
+      <w:pPr>
+        <w:spacing w:line="360" w:lineRule="auto" w:after="0"/>
+        <w:ind w:firstLine="709"/>
+        <w:jc w:val="both"/>
+      </w:pPr>
+      <w:r>
+        <w:rPr>
+          <w:rFonts w:ascii="Times New Roman" w:hAnsi="Times New Roman" w:cs="Times New Roman" w:eastAsia="Times New Roman"/>
+          <w:b w:val="0"/>
+          <w:color w:val="000000"/>
+          <w:sz w:val="28"/>
+        </w:rPr>
+        <w:t xml:space="preserve">20. MDN Web Docs: документация по веб-технологиям HTML, CSS и JavaScript / Mozilla Foundation. — Текст: электронный. — URL: </w:t>
+      </w:r>
+      <w:hyperlink r:id="rId23">
+        <w:r>
+          <w:rPr>
+            <w:rFonts w:ascii="Times New Roman" w:hAnsi="Times New Roman" w:cs="Times New Roman" w:eastAsia="Times New Roman"/>
+            <w:sz w:val="28"/>
+            <w:szCs w:val="28"/>
+            <w:color w:val="0563C1"/>
+            <w:u w:val="single"/>
+          </w:rPr>
+          <w:t xml:space="preserve">https://developer.mozilla.org/</w:t>
+        </w:r>
+      </w:hyperlink>
+      <w:r>
+        <w:rPr>
+          <w:rFonts w:ascii="Times New Roman" w:hAnsi="Times New Roman" w:cs="Times New Roman" w:eastAsia="Times New Roman"/>
+          <w:b w:val="0"/>
+          <w:color w:val="000000"/>
+          <w:sz w:val="28"/>
+        </w:rPr>
+        <w:t>.</w:t>
+      </w:r>
     </w:p>
     <w:sectPr>
       <w:pgSz w:w="12240" w:h="15840"/>

</xml_diff>